<commit_message>
docs: rewrite both reports
Reworked the primary report around the question the assignment is
actually about: what signal you steer by when coverage is off the
table. Opens by explaining the task for someone who hasn't read the
spec, then design, findings, challenges.

The honest addition is in Findings. The spec says its own trial run on
parson found crashes within five iterations and mine found none, so I
went back through the logs and worked out why: depth was the loudest
number I gave the model, it moved from 8 to 2052, and three of five
rounds chased it straight into the MAX_NESTING guard parson already
had. Acceptance read 'healthy' every round and so nothing pushed back.
That is a better answer than 'parson is small and well fuzzed'.

Also added the per-iteration drivers as a table column, the
timeout-as-crash judgment call, and the sanitizer build flags, all of
which the spec asks for and the old draft skipped. No em dashes in
either report. Both render to exactly two pages.
</commit_message>
<xml_diff>
--- a/report/report.docx
+++ b/report/report.docx
@@ -5,338 +5,263 @@
     <w:p>
       <w:pPr>
         <w:pStyle w:val="Heading1"/>
-        <w:spacing w:after="120" w:before="0"/>
-      </w:pPr>
-      <w:r>
-        <w:rPr>
-          <w:i w:val="false"/>
-          <w:iCs w:val="false"/>
-        </w:rPr>
-        <w:t xml:space="preserve">Agentic Fuzzing: driving an LLM from a grammar to a generator</w:t>
-      </w:r>
-    </w:p>
-    <w:p>
-      <w:pPr>
-        <w:spacing w:after="160" w:line="264"/>
+        <w:spacing w:after="80" w:before="0"/>
+      </w:pPr>
+      <w:r>
+        <w:t xml:space="preserve">Agentic Fuzzing without coverage</w:t>
+      </w:r>
+    </w:p>
+    <w:p>
+      <w:pPr>
+        <w:spacing w:after="100" w:line="240"/>
       </w:pPr>
       <w:r>
         <w:rPr>
           <w:b/>
           <w:bCs/>
-          <w:i w:val="false"/>
-          <w:iCs w:val="false"/>
         </w:rPr>
         <w:t xml:space="preserve">Target:</w:t>
       </w:r>
       <w:r>
-        <w:rPr>
-          <w:i w:val="false"/>
-          <w:iCs w:val="false"/>
-        </w:rPr>
         <w:t xml:space="preserve"> </w:t>
       </w:r>
-      <w:hyperlink w:history="1" r:id="rId4prdlimkahjoh4b32alvw">
+      <w:hyperlink w:history="1" r:id="rId7y-jemrrvd5wuuhgzma_n">
         <w:r>
           <w:rPr>
             <w:rStyle w:val="Hyperlink"/>
-            <w:i w:val="false"/>
-            <w:iCs w:val="false"/>
           </w:rPr>
           <w:t xml:space="preserve">parson</w:t>
         </w:r>
       </w:hyperlink>
       <w:r>
-        <w:rPr>
-          <w:i w:val="false"/>
-          <w:iCs w:val="false"/>
-        </w:rPr>
-        <w:t xml:space="preserve"> (JSON, C) at pinned commit </w:t>
-      </w:r>
-      <w:r>
-        <w:rPr>
-          <w:rFonts w:ascii="Consolas" w:cs="Consolas" w:eastAsia="Consolas" w:hAnsi="Consolas"/>
-          <w:i w:val="false"/>
-          <w:iCs w:val="false"/>
+        <w:t xml:space="preserve"> (JSON, C) @ </w:t>
+      </w:r>
+      <w:r>
+        <w:rPr>
+          <w:rFonts w:ascii="Consolas" w:cs="Consolas" w:eastAsia="Consolas" w:hAnsi="Consolas"/>
           <w:shd w:fill="F0F0F0" w:val="clear"/>
         </w:rPr>
         <w:t xml:space="preserve">ba29f4e</w:t>
       </w:r>
       <w:r>
-        <w:rPr>
-          <w:i w:val="false"/>
-          <w:iCs w:val="false"/>
-        </w:rPr>
-        <w:t xml:space="preserve"> </w:t>
+        <w:t xml:space="preserve">. </w:t>
       </w:r>
       <w:r>
         <w:rPr>
           <w:b/>
           <w:bCs/>
-          <w:i w:val="false"/>
-          <w:iCs w:val="false"/>
         </w:rPr>
         <w:t xml:space="preserve">Grammar:</w:t>
       </w:r>
       <w:r>
-        <w:rPr>
-          <w:i w:val="false"/>
-          <w:iCs w:val="false"/>
-        </w:rPr>
         <w:t xml:space="preserve"> grammars-v4 </w:t>
       </w:r>
       <w:r>
         <w:rPr>
           <w:rFonts w:ascii="Consolas" w:cs="Consolas" w:eastAsia="Consolas" w:hAnsi="Consolas"/>
-          <w:i w:val="false"/>
-          <w:iCs w:val="false"/>
           <w:shd w:fill="F0F0F0" w:val="clear"/>
         </w:rPr>
         <w:t xml:space="preserve">json/JSON.g4</w:t>
       </w:r>
       <w:r>
-        <w:rPr>
-          <w:i w:val="false"/>
-          <w:iCs w:val="false"/>
-        </w:rPr>
-        <w:t xml:space="preserve"> at pinned commit </w:t>
-      </w:r>
-      <w:r>
-        <w:rPr>
-          <w:rFonts w:ascii="Consolas" w:cs="Consolas" w:eastAsia="Consolas" w:hAnsi="Consolas"/>
-          <w:i w:val="false"/>
-          <w:iCs w:val="false"/>
+        <w:t xml:space="preserve"> @ </w:t>
+      </w:r>
+      <w:r>
+        <w:rPr>
+          <w:rFonts w:ascii="Consolas" w:cs="Consolas" w:eastAsia="Consolas" w:hAnsi="Consolas"/>
           <w:shd w:fill="F0F0F0" w:val="clear"/>
         </w:rPr>
         <w:t xml:space="preserve">e1c222f</w:t>
       </w:r>
       <w:r>
-        <w:rPr>
-          <w:i w:val="false"/>
-          <w:iCs w:val="false"/>
-        </w:rPr>
-        <w:t xml:space="preserve"> </w:t>
+        <w:t xml:space="preserve">. </w:t>
       </w:r>
       <w:r>
         <w:rPr>
           <w:b/>
           <w:bCs/>
-          <w:i w:val="false"/>
-          <w:iCs w:val="false"/>
         </w:rPr>
         <w:t xml:space="preserve">Result:</w:t>
       </w:r>
       <w:r>
-        <w:rPr>
-          <w:i w:val="false"/>
-          <w:iCs w:val="false"/>
-        </w:rPr>
-        <w:t xml:space="preserve"> 5 iterations, 2,500 inputs, 0 crashes, $0.86 (91,927 tokens) of a $5 budget</w:t>
+        <w:t xml:space="preserve"> 5 iterations, 2,500 inputs, 0 crashes, $0.86 (91,927 tokens) of a $5 budget.</w:t>
       </w:r>
     </w:p>
     <w:p>
       <w:pPr>
         <w:pStyle w:val="Heading2"/>
-        <w:spacing w:after="120" w:before="240"/>
-      </w:pPr>
-      <w:r>
-        <w:rPr>
-          <w:i w:val="false"/>
-          <w:iCs w:val="false"/>
-        </w:rPr>
-        <w:t xml:space="preserve">What this is</w:t>
-      </w:r>
-    </w:p>
-    <w:p>
-      <w:pPr>
-        <w:spacing w:after="160" w:line="264"/>
-      </w:pPr>
-      <w:r>
-        <w:rPr>
-          <w:i w:val="false"/>
-          <w:iCs w:val="false"/>
-        </w:rPr>
-        <w:t xml:space="preserve">A fuzzer needs inputs shaped like the format it's testing, or almost everything gets rejected in the first few bytes. This project gets that shape from a formal grammar, but an LLM writes the generator instead of a human, then rewrites it five times using measurements from the round before. The hard part isn't getting an LLM to write a generator. It's deciding what to measure so you can tell whether the last one was any good, especially with coverage instrumentation banned on the target.</w:t>
+        <w:spacing w:after="80" w:before="160"/>
+      </w:pPr>
+      <w:r>
+        <w:t xml:space="preserve">The problem</w:t>
+      </w:r>
+    </w:p>
+    <w:p>
+      <w:pPr>
+        <w:spacing w:after="100" w:line="240"/>
+      </w:pPr>
+      <w:r>
+        <w:t xml:space="preserve">Fuzzing a parser is easy to do badly. Throw random bytes at a JSON library and nearly every input dies in the first few characters, so you test the tokenizer thousands of times and the real parser never. The fix is to generate inputs already shaped like the format, which is what a formal grammar gives you for free.</w:t>
+      </w:r>
+    </w:p>
+    <w:p>
+      <w:pPr>
+        <w:spacing w:after="100" w:line="240"/>
+      </w:pPr>
+      <w:r>
+        <w:t xml:space="preserve">This assignment adds a twist: don't write that generator yourself. Give an LLM the grammar, have it write a </w:t>
+      </w:r>
+      <w:hyperlink w:history="1" r:id="rIdpzxduulr3xigoqx9_yz17">
+        <w:r>
+          <w:rPr>
+            <w:rStyle w:val="Hyperlink"/>
+          </w:rPr>
+          <w:t xml:space="preserve">Hypothesis</w:t>
+        </w:r>
+      </w:hyperlink>
+      <w:r>
+        <w:t xml:space="preserve"> strategy, run the output through a sanitizer build of the real C library, and feed the measurements back so it can revise. Five rounds, or five dollars, whichever runs out first. And you may not instrument the target for coverage, which is normally how you'd know whether a generator improved. So the real question isn't whether an LLM can write one, because it can, first try. It's what you show it on round two.</w:t>
       </w:r>
     </w:p>
     <w:p>
       <w:pPr>
         <w:pStyle w:val="Heading2"/>
-        <w:spacing w:after="120" w:before="240"/>
-      </w:pPr>
-      <w:r>
-        <w:rPr>
-          <w:i w:val="false"/>
-          <w:iCs w:val="false"/>
-        </w:rPr>
+        <w:spacing w:after="80" w:before="160"/>
+      </w:pPr>
+      <w:r>
         <w:t xml:space="preserve">Design</w:t>
       </w:r>
     </w:p>
     <w:p>
       <w:pPr>
-        <w:spacing w:after="160" w:line="264"/>
+        <w:spacing w:after="100" w:line="240"/>
       </w:pPr>
       <w:r>
         <w:rPr>
           <w:b/>
           <w:bCs/>
-          <w:i w:val="false"/>
-          <w:iCs w:val="false"/>
-        </w:rPr>
-        <w:t xml:space="preserve">Grammar.</w:t>
-      </w:r>
-      <w:r>
-        <w:rPr>
-          <w:i w:val="false"/>
-          <w:iCs w:val="false"/>
-        </w:rPr>
-        <w:t xml:space="preserve"> The 77-line JSON grammar from grammars-v4 goes into the prompt whole, since summarizing risks silently dropping a production. But the grammar describes JSON in the abstract, not parson, so instead of guessing where they disagree I measured it: 33 boundary inputs plus a bisection against the sanitizer build (</w:t>
-      </w:r>
-      <w:r>
-        <w:rPr>
-          <w:rFonts w:ascii="Consolas" w:cs="Consolas" w:eastAsia="Consolas" w:hAnsi="Consolas"/>
-          <w:i w:val="false"/>
-          <w:iCs w:val="false"/>
+        </w:rPr>
+        <w:t xml:space="preserve">Grammar and adaptations.</w:t>
+      </w:r>
+      <w:r>
+        <w:t xml:space="preserve"> The 77-line JSON grammar goes into the prompt whole, since summarizing risks quietly dropping a production. But the grammar describes JSON in the abstract, not parson, and the gap between the two is where the real parsing code lives. Rather than guess, I measured it: 33 boundary inputs plus a bisection against the sanitizer build (</w:t>
+      </w:r>
+      <w:r>
+        <w:rPr>
+          <w:rFonts w:ascii="Consolas" w:cs="Consolas" w:eastAsia="Consolas" w:hAnsi="Consolas"/>
           <w:shd w:fill="F0F0F0" w:val="clear"/>
         </w:rPr>
         <w:t xml:space="preserve">grammar/json-parson/ADAPTATIONS.md</w:t>
       </w:r>
       <w:r>
-        <w:rPr>
-          <w:i w:val="false"/>
-          <w:iCs w:val="false"/>
-        </w:rPr>
-        <w:t xml:space="preserve">). parson accepts things the grammar forbids (a trailing comma, garbage after the first value) and rejects things it allows (duplicate keys, lone surrogate escapes). It caps nesting at 2049 for arrays and 2048 for objects, an exact wall, not a soft one.</w:t>
-      </w:r>
-    </w:p>
-    <w:p>
-      <w:pPr>
-        <w:spacing w:after="160" w:line="264"/>
+        <w:t xml:space="preserve">). parson accepts things the grammar forbids (a trailing comma, anything after the first value, a BOM, </w:t>
+      </w:r>
+      <w:r>
+        <w:rPr>
+          <w:rFonts w:ascii="Consolas" w:cs="Consolas" w:eastAsia="Consolas" w:hAnsi="Consolas"/>
+          <w:shd w:fill="F0F0F0" w:val="clear"/>
+        </w:rPr>
+        <w:t xml:space="preserve">1.</w:t>
+      </w:r>
+      <w:r>
+        <w:t xml:space="preserve">, raw invalid UTF-8 in strings) and rejects things it allows (duplicate keys, lone surrogates, exponents that overflow a double). It caps nesting at 2049 for arrays and 2048 for objects, and that one-level difference is real and repeatable. They go in beside the grammar, because a generator emitting only grammar-legal text never reaches the superset paths.</w:t>
+      </w:r>
+    </w:p>
+    <w:p>
+      <w:pPr>
+        <w:spacing w:after="100" w:line="240"/>
       </w:pPr>
       <w:r>
         <w:rPr>
           <w:b/>
           <w:bCs/>
-          <w:i w:val="false"/>
-          <w:iCs w:val="false"/>
-        </w:rPr>
-        <w:t xml:space="preserve">Harness.</w:t>
-      </w:r>
-      <w:r>
-        <w:rPr>
-          <w:i w:val="false"/>
-          <w:iCs w:val="false"/>
-        </w:rPr>
-        <w:t xml:space="preserve"> The hardest judgment call is what counts as a bug: "invalid input" is correct behavior, a sanitizer abort or fatal signal is not. The harness calls </w:t>
-      </w:r>
-      <w:r>
-        <w:rPr>
-          <w:rFonts w:ascii="Consolas" w:cs="Consolas" w:eastAsia="Consolas" w:hAnsi="Consolas"/>
-          <w:i w:val="false"/>
-          <w:iCs w:val="false"/>
+        </w:rPr>
+        <w:t xml:space="preserve">Harness and build.</w:t>
+      </w:r>
+      <w:r>
+        <w:t xml:space="preserve"> The hardest thing to get right is what counts as a bug, because "invalid input" is the parser working correctly. The harness reads stdin, calls </w:t>
+      </w:r>
+      <w:r>
+        <w:rPr>
+          <w:rFonts w:ascii="Consolas" w:cs="Consolas" w:eastAsia="Consolas" w:hAnsi="Consolas"/>
           <w:shd w:fill="F0F0F0" w:val="clear"/>
         </w:rPr>
         <w:t xml:space="preserve">json_parse_string</w:t>
       </w:r>
       <w:r>
-        <w:rPr>
-          <w:i w:val="false"/>
-          <w:iCs w:val="false"/>
-        </w:rPr>
-        <w:t xml:space="preserve"> and exits 0 on success, 1 on a clean </w:t>
-      </w:r>
-      <w:r>
-        <w:rPr>
-          <w:rFonts w:ascii="Consolas" w:cs="Consolas" w:eastAsia="Consolas" w:hAnsi="Consolas"/>
-          <w:i w:val="false"/>
-          <w:iCs w:val="false"/>
+        <w:t xml:space="preserve">, and exits 0 when a value comes back, 1 on a clean </w:t>
+      </w:r>
+      <w:r>
+        <w:rPr>
+          <w:rFonts w:ascii="Consolas" w:cs="Consolas" w:eastAsia="Consolas" w:hAnsi="Consolas"/>
           <w:shd w:fill="F0F0F0" w:val="clear"/>
         </w:rPr>
         <w:t xml:space="preserve">NULL</w:t>
       </w:r>
       <w:r>
-        <w:rPr>
-          <w:i w:val="false"/>
-          <w:iCs w:val="false"/>
-        </w:rPr>
-        <w:t xml:space="preserve">, 2 if the harness itself fails. One trap worth naming: ASan's default exit code is 1, same as the reject code, so without </w:t>
-      </w:r>
-      <w:r>
-        <w:rPr>
-          <w:rFonts w:ascii="Consolas" w:cs="Consolas" w:eastAsia="Consolas" w:hAnsi="Consolas"/>
-          <w:i w:val="false"/>
-          <w:iCs w:val="false"/>
+        <w:t xml:space="preserve">, 2 if the harness itself fails. Anything else, a fatal signal or sanitizer abort, is a real bug. The build supplies the abort: ASan and UBSan with </w:t>
+      </w:r>
+      <w:r>
+        <w:rPr>
+          <w:rFonts w:ascii="Consolas" w:cs="Consolas" w:eastAsia="Consolas" w:hAnsi="Consolas"/>
+          <w:shd w:fill="F0F0F0" w:val="clear"/>
+        </w:rPr>
+        <w:t xml:space="preserve">-fno-sanitize-recover=all</w:t>
+      </w:r>
+      <w:r>
+        <w:t xml:space="preserve">, so undefined behavior stops the process instead of continuing quietly. One trap silently destroys the experiment: ASan's default exit code is 1, identical to the reject code, so without </w:t>
+      </w:r>
+      <w:r>
+        <w:rPr>
+          <w:rFonts w:ascii="Consolas" w:cs="Consolas" w:eastAsia="Consolas" w:hAnsi="Consolas"/>
           <w:shd w:fill="F0F0F0" w:val="clear"/>
         </w:rPr>
         <w:t xml:space="preserve">ASAN_OPTIONS=abort_on_error=1</w:t>
       </w:r>
       <w:r>
-        <w:rPr>
-          <w:i w:val="false"/>
-          <w:iCs w:val="false"/>
-        </w:rPr>
-        <w:t xml:space="preserve"> every memory bug gets filed as a polite rejection.</w:t>
-      </w:r>
-    </w:p>
-    <w:p>
-      <w:pPr>
-        <w:spacing w:after="160" w:line="264"/>
+        <w:t xml:space="preserve"> every memory bug gets filed as a polite rejection. Timeouts get 5 seconds and are triaged as crashes, since a parser that hangs is a denial-of-service bug, not a pass.</w:t>
+      </w:r>
+    </w:p>
+    <w:p>
+      <w:pPr>
+        <w:spacing w:after="100" w:line="240"/>
       </w:pPr>
       <w:r>
         <w:rPr>
           <w:b/>
           <w:bCs/>
-          <w:i w:val="false"/>
-          <w:iCs w:val="false"/>
         </w:rPr>
         <w:t xml:space="preserve">The loop and its signal.</w:t>
       </w:r>
       <w:r>
-        <w:rPr>
-          <w:i w:val="false"/>
-          <w:iCs w:val="false"/>
-        </w:rPr>
-        <w:t xml:space="preserve"> Each round: prompt the model, save the module, sanity-check a dozen examples, run 500 through the harness, summarize, feed it back. With coverage off the table, three things stand in for it: acceptance rate (is the generator clearing the tokenizer), production coverage (which grammar rules it's actually touched, from each strategy declaring which one it's expanding), and nesting depth (is the recursion real or cosmetic). All three are things a reviewer would ask about a generator anyway, and they cost nothing since they live in the generator, not the target.</w:t>
+        <w:t xml:space="preserve"> Each round prompts the model, saves the module, sanity-checks a dozen examples to catch one that won't even import, runs 500 inputs through the harness, and hands the summary back. With coverage off the table, three measurements stand in: acceptance rate, production coverage (each strategy declares which grammar rule it's expanding), and nesting depth. I chose those three because they map onto the three ways a grammar-derived generator usually fails: it bounces off the tokenizer, it silently never reaches some rules, or its recursion is cosmetic and everything comes out flat. All three live in the generator, not the target, so they cost nothing and break no rules.</w:t>
       </w:r>
     </w:p>
     <w:p>
       <w:pPr>
         <w:pStyle w:val="Heading2"/>
-        <w:spacing w:after="120" w:before="240"/>
-      </w:pPr>
-      <w:r>
-        <w:rPr>
-          <w:i w:val="false"/>
-          <w:iCs w:val="false"/>
-        </w:rPr>
+        <w:spacing w:after="80" w:before="160"/>
+      </w:pPr>
+      <w:r>
         <w:t xml:space="preserve">Findings</w:t>
       </w:r>
     </w:p>
     <w:p>
       <w:pPr>
-        <w:spacing w:after="160" w:line="264"/>
-      </w:pPr>
-      <w:r>
-        <w:rPr>
-          <w:i w:val="false"/>
-          <w:iCs w:val="false"/>
-        </w:rPr>
-        <w:t xml:space="preserve">parson survived all 2,500 inputs under ASan and UBSan. No crashes. That's a real result, not a broken pipeline: the same crash path was checked against a toy parser with three planted bugs, and all three were caught, deduped, and minimized correctly before any real target existed (</w:t>
-      </w:r>
-      <w:r>
-        <w:rPr>
-          <w:rFonts w:ascii="Consolas" w:cs="Consolas" w:eastAsia="Consolas" w:hAnsi="Consolas"/>
-          <w:i w:val="false"/>
-          <w:iCs w:val="false"/>
+        <w:spacing w:after="100" w:line="240"/>
+      </w:pPr>
+      <w:r>
+        <w:t xml:space="preserve">parson survived all 2,500 inputs under ASan and UBSan with zero crashes. That isn't a broken pipeline: the crash path was validated first against a toy parser with three planted bugs, all caught, deduplicated, and minimized correctly (</w:t>
+      </w:r>
+      <w:r>
+        <w:rPr>
+          <w:rFonts w:ascii="Consolas" w:cs="Consolas" w:eastAsia="Consolas" w:hAnsi="Consolas"/>
           <w:shd w:fill="F0F0F0" w:val="clear"/>
         </w:rPr>
         <w:t xml:space="preserve">spine_check/</w:t>
       </w:r>
       <w:r>
-        <w:rPr>
-          <w:i w:val="false"/>
-          <w:iCs w:val="false"/>
-        </w:rPr>
-        <w:t xml:space="preserve">, 6/6). parson is small and has been fuzzed by plenty of people already; five iterations wasn't enough to find what's left.</w:t>
+        <w:t xml:space="preserve">, 6/6).</w:t>
       </w:r>
     </w:p>
     <w:tbl>
@@ -352,18 +277,21 @@
         </w:tblBorders>
       </w:tblPr>
       <w:tblGrid>
-        <w:gridCol w:w="2340"/>
-        <w:gridCol w:w="2340"/>
-        <w:gridCol w:w="2340"/>
-        <w:gridCol w:w="2340"/>
+        <w:gridCol w:w="1386"/>
+        <w:gridCol w:w="1508"/>
+        <w:gridCol w:w="946"/>
+        <w:gridCol w:w="5520"/>
       </w:tblGrid>
       <w:tr>
         <w:tc>
           <w:tcPr>
-            <w:tcW w:type="dxa" w:w="2340"/>
+            <w:tcW w:type="dxa" w:w="1386"/>
             <w:shd w:fill="E8E8E8" w:val="clear"/>
           </w:tcPr>
           <w:p>
+            <w:pPr>
+              <w:spacing w:after="0" w:line="240"/>
+            </w:pPr>
             <w:r>
               <w:rPr>
                 <w:b/>
@@ -375,10 +303,13 @@
         </w:tc>
         <w:tc>
           <w:tcPr>
-            <w:tcW w:type="dxa" w:w="2340"/>
+            <w:tcW w:type="dxa" w:w="1508"/>
             <w:shd w:fill="E8E8E8" w:val="clear"/>
           </w:tcPr>
           <w:p>
+            <w:pPr>
+              <w:spacing w:after="0" w:line="240"/>
+            </w:pPr>
             <w:r>
               <w:rPr>
                 <w:b/>
@@ -390,10 +321,13 @@
         </w:tc>
         <w:tc>
           <w:tcPr>
-            <w:tcW w:type="dxa" w:w="2340"/>
+            <w:tcW w:type="dxa" w:w="946"/>
             <w:shd w:fill="E8E8E8" w:val="clear"/>
           </w:tcPr>
           <w:p>
+            <w:pPr>
+              <w:spacing w:after="0" w:line="240"/>
+            </w:pPr>
             <w:r>
               <w:rPr>
                 <w:b/>
@@ -405,16 +339,19 @@
         </w:tc>
         <w:tc>
           <w:tcPr>
-            <w:tcW w:type="dxa" w:w="2340"/>
+            <w:tcW w:type="dxa" w:w="5520"/>
             <w:shd w:fill="E8E8E8" w:val="clear"/>
           </w:tcPr>
           <w:p>
+            <w:pPr>
+              <w:spacing w:after="0" w:line="240"/>
+            </w:pPr>
             <w:r>
               <w:rPr>
                 <w:b/>
                 <w:bCs/>
               </w:rPr>
-              <w:t xml:space="preserve">Crashes</w:t>
+              <w:t xml:space="preserve">What drove the change</w:t>
             </w:r>
           </w:p>
         </w:tc>
@@ -422,57 +359,53 @@
       <w:tr>
         <w:tc>
           <w:tcPr>
-            <w:tcW w:type="dxa" w:w="2340"/>
-          </w:tcPr>
-          <w:p>
-            <w:r>
-              <w:rPr>
-                <w:i w:val="false"/>
-                <w:iCs w:val="false"/>
-              </w:rPr>
+            <w:tcW w:type="dxa" w:w="1386"/>
+          </w:tcPr>
+          <w:p>
+            <w:pPr>
+              <w:spacing w:after="0" w:line="240"/>
+            </w:pPr>
+            <w:r>
               <w:t xml:space="preserve">0</w:t>
             </w:r>
           </w:p>
         </w:tc>
         <w:tc>
           <w:tcPr>
-            <w:tcW w:type="dxa" w:w="2340"/>
-          </w:tcPr>
-          <w:p>
-            <w:r>
-              <w:rPr>
-                <w:i w:val="false"/>
-                <w:iCs w:val="false"/>
-              </w:rPr>
+            <w:tcW w:type="dxa" w:w="1508"/>
+          </w:tcPr>
+          <w:p>
+            <w:pPr>
+              <w:spacing w:after="0" w:line="240"/>
+            </w:pPr>
+            <w:r>
               <w:t xml:space="preserve">45.0%</w:t>
             </w:r>
           </w:p>
         </w:tc>
         <w:tc>
           <w:tcPr>
-            <w:tcW w:type="dxa" w:w="2340"/>
-          </w:tcPr>
-          <w:p>
-            <w:r>
-              <w:rPr>
-                <w:i w:val="false"/>
-                <w:iCs w:val="false"/>
-              </w:rPr>
+            <w:tcW w:type="dxa" w:w="946"/>
+          </w:tcPr>
+          <w:p>
+            <w:pPr>
+              <w:spacing w:after="0" w:line="240"/>
+            </w:pPr>
+            <w:r>
               <w:t xml:space="preserve">8</w:t>
             </w:r>
           </w:p>
         </w:tc>
         <w:tc>
           <w:tcPr>
-            <w:tcW w:type="dxa" w:w="2340"/>
-          </w:tcPr>
-          <w:p>
-            <w:r>
-              <w:rPr>
-                <w:i w:val="false"/>
-                <w:iCs w:val="false"/>
-              </w:rPr>
-              <w:t xml:space="preserve">0</w:t>
+            <w:tcW w:type="dxa" w:w="5520"/>
+          </w:tcPr>
+          <w:p>
+            <w:pPr>
+              <w:spacing w:after="0" w:line="240"/>
+            </w:pPr>
+            <w:r>
+              <w:t xml:space="preserve">seed from grammar + measured gaps</w:t>
             </w:r>
           </w:p>
         </w:tc>
@@ -480,57 +413,53 @@
       <w:tr>
         <w:tc>
           <w:tcPr>
-            <w:tcW w:type="dxa" w:w="2340"/>
-          </w:tcPr>
-          <w:p>
-            <w:r>
-              <w:rPr>
-                <w:i w:val="false"/>
-                <w:iCs w:val="false"/>
-              </w:rPr>
+            <w:tcW w:type="dxa" w:w="1386"/>
+          </w:tcPr>
+          <w:p>
+            <w:pPr>
+              <w:spacing w:after="0" w:line="240"/>
+            </w:pPr>
+            <w:r>
               <w:t xml:space="preserve">1</w:t>
             </w:r>
           </w:p>
         </w:tc>
         <w:tc>
           <w:tcPr>
-            <w:tcW w:type="dxa" w:w="2340"/>
-          </w:tcPr>
-          <w:p>
-            <w:r>
-              <w:rPr>
-                <w:i w:val="false"/>
-                <w:iCs w:val="false"/>
-              </w:rPr>
+            <w:tcW w:type="dxa" w:w="1508"/>
+          </w:tcPr>
+          <w:p>
+            <w:pPr>
+              <w:spacing w:after="0" w:line="240"/>
+            </w:pPr>
+            <w:r>
               <w:t xml:space="preserve">40.2%</w:t>
             </w:r>
           </w:p>
         </w:tc>
         <w:tc>
           <w:tcPr>
-            <w:tcW w:type="dxa" w:w="2340"/>
-          </w:tcPr>
-          <w:p>
-            <w:r>
-              <w:rPr>
-                <w:i w:val="false"/>
-                <w:iCs w:val="false"/>
-              </w:rPr>
+            <w:tcW w:type="dxa" w:w="946"/>
+          </w:tcPr>
+          <w:p>
+            <w:pPr>
+              <w:spacing w:after="0" w:line="240"/>
+            </w:pPr>
+            <w:r>
               <w:t xml:space="preserve">7</w:t>
             </w:r>
           </w:p>
         </w:tc>
         <w:tc>
           <w:tcPr>
-            <w:tcW w:type="dxa" w:w="2340"/>
-          </w:tcPr>
-          <w:p>
-            <w:r>
-              <w:rPr>
-                <w:i w:val="false"/>
-                <w:iCs w:val="false"/>
-              </w:rPr>
-              <w:t xml:space="preserve">0</w:t>
+            <w:tcW w:type="dxa" w:w="5520"/>
+          </w:tcPr>
+          <w:p>
+            <w:pPr>
+              <w:spacing w:after="0" w:line="240"/>
+            </w:pPr>
+            <w:r>
+              <w:t xml:space="preserve">dropped an unrecognized production label, widened leaf budget</w:t>
             </w:r>
           </w:p>
         </w:tc>
@@ -538,57 +467,53 @@
       <w:tr>
         <w:tc>
           <w:tcPr>
-            <w:tcW w:type="dxa" w:w="2340"/>
-          </w:tcPr>
-          <w:p>
-            <w:r>
-              <w:rPr>
-                <w:i w:val="false"/>
-                <w:iCs w:val="false"/>
-              </w:rPr>
+            <w:tcW w:type="dxa" w:w="1386"/>
+          </w:tcPr>
+          <w:p>
+            <w:pPr>
+              <w:spacing w:after="0" w:line="240"/>
+            </w:pPr>
+            <w:r>
               <w:t xml:space="preserve">2</w:t>
             </w:r>
           </w:p>
         </w:tc>
         <w:tc>
           <w:tcPr>
-            <w:tcW w:type="dxa" w:w="2340"/>
-          </w:tcPr>
-          <w:p>
-            <w:r>
-              <w:rPr>
-                <w:i w:val="false"/>
-                <w:iCs w:val="false"/>
-              </w:rPr>
+            <w:tcW w:type="dxa" w:w="1508"/>
+          </w:tcPr>
+          <w:p>
+            <w:pPr>
+              <w:spacing w:after="0" w:line="240"/>
+            </w:pPr>
+            <w:r>
               <w:t xml:space="preserve">58.6%</w:t>
             </w:r>
           </w:p>
         </w:tc>
         <w:tc>
           <w:tcPr>
-            <w:tcW w:type="dxa" w:w="2340"/>
-          </w:tcPr>
-          <w:p>
-            <w:r>
-              <w:rPr>
-                <w:i w:val="false"/>
-                <w:iCs w:val="false"/>
-              </w:rPr>
+            <w:tcW w:type="dxa" w:w="946"/>
+          </w:tcPr>
+          <w:p>
+            <w:pPr>
+              <w:spacing w:after="0" w:line="240"/>
+            </w:pPr>
+            <w:r>
               <w:t xml:space="preserve">2051</w:t>
             </w:r>
           </w:p>
         </w:tc>
         <w:tc>
           <w:tcPr>
-            <w:tcW w:type="dxa" w:w="2340"/>
-          </w:tcPr>
-          <w:p>
-            <w:r>
-              <w:rPr>
-                <w:i w:val="false"/>
-                <w:iCs w:val="false"/>
-              </w:rPr>
-              <w:t xml:space="preserve">0</w:t>
+            <w:tcW w:type="dxa" w:w="5520"/>
+          </w:tcPr>
+          <w:p>
+            <w:pPr>
+              <w:spacing w:after="0" w:line="240"/>
+            </w:pPr>
+            <w:r>
+              <w:t xml:space="preserve">fixed the depth instrumentation bug, added mid-range nesting</w:t>
             </w:r>
           </w:p>
         </w:tc>
@@ -596,57 +521,53 @@
       <w:tr>
         <w:tc>
           <w:tcPr>
-            <w:tcW w:type="dxa" w:w="2340"/>
-          </w:tcPr>
-          <w:p>
-            <w:r>
-              <w:rPr>
-                <w:i w:val="false"/>
-                <w:iCs w:val="false"/>
-              </w:rPr>
+            <w:tcW w:type="dxa" w:w="1386"/>
+          </w:tcPr>
+          <w:p>
+            <w:pPr>
+              <w:spacing w:after="0" w:line="240"/>
+            </w:pPr>
+            <w:r>
               <w:t xml:space="preserve">3</w:t>
             </w:r>
           </w:p>
         </w:tc>
         <w:tc>
           <w:tcPr>
-            <w:tcW w:type="dxa" w:w="2340"/>
-          </w:tcPr>
-          <w:p>
-            <w:r>
-              <w:rPr>
-                <w:i w:val="false"/>
-                <w:iCs w:val="false"/>
-              </w:rPr>
+            <w:tcW w:type="dxa" w:w="1508"/>
+          </w:tcPr>
+          <w:p>
+            <w:pPr>
+              <w:spacing w:after="0" w:line="240"/>
+            </w:pPr>
+            <w:r>
               <w:t xml:space="preserve">53.2%</w:t>
             </w:r>
           </w:p>
         </w:tc>
         <w:tc>
           <w:tcPr>
-            <w:tcW w:type="dxa" w:w="2340"/>
-          </w:tcPr>
-          <w:p>
-            <w:r>
-              <w:rPr>
-                <w:i w:val="false"/>
-                <w:iCs w:val="false"/>
-              </w:rPr>
+            <w:tcW w:type="dxa" w:w="946"/>
+          </w:tcPr>
+          <w:p>
+            <w:pPr>
+              <w:spacing w:after="0" w:line="240"/>
+            </w:pPr>
+            <w:r>
               <w:t xml:space="preserve">2051</w:t>
             </w:r>
           </w:p>
         </w:tc>
         <w:tc>
           <w:tcPr>
-            <w:tcW w:type="dxa" w:w="2340"/>
-          </w:tcPr>
-          <w:p>
-            <w:r>
-              <w:rPr>
-                <w:i w:val="false"/>
-                <w:iCs w:val="false"/>
-              </w:rPr>
-              <w:t xml:space="preserve">0</w:t>
+            <w:tcW w:type="dxa" w:w="5520"/>
+          </w:tcPr>
+          <w:p>
+            <w:pPr>
+              <w:spacing w:after="0" w:line="240"/>
+            </w:pPr>
+            <w:r>
+              <w:t xml:space="preserve">nested duplicate keys, block comments, more invalid UTF-8</w:t>
             </w:r>
           </w:p>
         </w:tc>
@@ -654,57 +575,53 @@
       <w:tr>
         <w:tc>
           <w:tcPr>
-            <w:tcW w:type="dxa" w:w="2340"/>
-          </w:tcPr>
-          <w:p>
-            <w:r>
-              <w:rPr>
-                <w:i w:val="false"/>
-                <w:iCs w:val="false"/>
-              </w:rPr>
+            <w:tcW w:type="dxa" w:w="1386"/>
+          </w:tcPr>
+          <w:p>
+            <w:pPr>
+              <w:spacing w:after="0" w:line="240"/>
+            </w:pPr>
+            <w:r>
               <w:t xml:space="preserve">4</w:t>
             </w:r>
           </w:p>
         </w:tc>
         <w:tc>
           <w:tcPr>
-            <w:tcW w:type="dxa" w:w="2340"/>
-          </w:tcPr>
-          <w:p>
-            <w:r>
-              <w:rPr>
-                <w:i w:val="false"/>
-                <w:iCs w:val="false"/>
-              </w:rPr>
+            <w:tcW w:type="dxa" w:w="1508"/>
+          </w:tcPr>
+          <w:p>
+            <w:pPr>
+              <w:spacing w:after="0" w:line="240"/>
+            </w:pPr>
+            <w:r>
               <w:t xml:space="preserve">52.6%</w:t>
             </w:r>
           </w:p>
         </w:tc>
         <w:tc>
           <w:tcPr>
-            <w:tcW w:type="dxa" w:w="2340"/>
-          </w:tcPr>
-          <w:p>
-            <w:r>
-              <w:rPr>
-                <w:i w:val="false"/>
-                <w:iCs w:val="false"/>
-              </w:rPr>
+            <w:tcW w:type="dxa" w:w="946"/>
+          </w:tcPr>
+          <w:p>
+            <w:pPr>
+              <w:spacing w:after="0" w:line="240"/>
+            </w:pPr>
+            <w:r>
               <w:t xml:space="preserve">2052</w:t>
             </w:r>
           </w:p>
         </w:tc>
         <w:tc>
           <w:tcPr>
-            <w:tcW w:type="dxa" w:w="2340"/>
-          </w:tcPr>
-          <w:p>
-            <w:r>
-              <w:rPr>
-                <w:i w:val="false"/>
-                <w:iCs w:val="false"/>
-              </w:rPr>
-              <w:t xml:space="preserve">0</w:t>
+            <w:tcW w:type="dxa" w:w="5520"/>
+          </w:tcPr>
+          <w:p>
+            <w:pPr>
+              <w:spacing w:after="0" w:line="240"/>
+            </w:pPr>
+            <w:r>
+              <w:t xml:space="preserve">exact wall depths, alternating array/object nesting</w:t>
             </w:r>
           </w:p>
         </w:tc>
@@ -712,224 +629,176 @@
     </w:tbl>
     <w:p>
       <w:pPr>
-        <w:spacing w:after="120"/>
-      </w:pPr>
-    </w:p>
-    <w:p>
-      <w:pPr>
-        <w:spacing w:after="160" w:line="264"/>
-      </w:pPr>
-      <w:r>
-        <w:rPr>
-          <w:i w:val="false"/>
-          <w:iCs w:val="false"/>
-        </w:rPr>
-        <w:t xml:space="preserve">Acceptance stayed healthy throughout, so inputs reached the parser instead of bouncing off the tokenizer. The interesting part is depth. Iteration 1 had a probe aimed at 2,000+ levels of nesting, and the histogram topped out at 7. From that one number the model worked out its </w:t>
-      </w:r>
-      <w:r>
-        <w:rPr>
-          <w:rFonts w:ascii="Consolas" w:cs="Consolas" w:eastAsia="Consolas" w:hAnsi="Consolas"/>
-          <w:i w:val="false"/>
-          <w:iCs w:val="false"/>
+        <w:spacing w:after="0" w:line="120"/>
+      </w:pPr>
+    </w:p>
+    <w:p>
+      <w:pPr>
+        <w:spacing w:after="100" w:line="240"/>
+      </w:pPr>
+      <w:r>
+        <w:t xml:space="preserve">The best moment is iteration 2. The round before shipped a probe aimed at 2,000+ levels of nesting, and the depth histogram came back topping out at 7. From that single number the model worked out that its </w:t>
+      </w:r>
+      <w:r>
+        <w:rPr>
+          <w:rFonts w:ascii="Consolas" w:cs="Consolas" w:eastAsia="Consolas" w:hAnsi="Consolas"/>
           <w:shd w:fill="F0F0F0" w:val="clear"/>
         </w:rPr>
         <w:t xml:space="preserve">production()</w:t>
       </w:r>
       <w:r>
-        <w:rPr>
-          <w:i w:val="false"/>
-          <w:iCs w:val="false"/>
-        </w:rPr>
-        <w:t xml:space="preserve"> call was wrapping the whole document instead of each level, fixed it, and depth jumped to 2051 next round. That's the exact "recursive generator that secretly flattens" failure the assignment calls out, caught by the signal instead of by luck. Later rounds spent the rest of the budget on documented gaps (duplicate keys, block comments, malformed UTF-8, both nesting walls), each change tied to a number from the prior summary.</w:t>
-      </w:r>
-    </w:p>
-    <w:p>
-      <w:pPr>
-        <w:spacing w:after="160" w:line="264"/>
-      </w:pPr>
-      <w:r>
-        <w:rPr>
-          <w:i w:val="false"/>
-          <w:iCs w:val="false"/>
-        </w:rPr>
+        <w:t xml:space="preserve"> call was wrapping the whole document instead of each level, rewrote it with an </w:t>
+      </w:r>
+      <w:r>
+        <w:rPr>
+          <w:rFonts w:ascii="Consolas" w:cs="Consolas" w:eastAsia="Consolas" w:hAnsi="Consolas"/>
+          <w:shd w:fill="F0F0F0" w:val="clear"/>
+        </w:rPr>
+        <w:t xml:space="preserve">ExitStack</w:t>
+      </w:r>
+      <w:r>
+        <w:t xml:space="preserve"> entering one context per level, and depth jumped to 2051. That is exactly the "recursive generator that secretly flattens" failure the assignment warns about, caught by the signal instead of by luck.</w:t>
+      </w:r>
+    </w:p>
+    <w:p>
+      <w:pPr>
+        <w:spacing w:after="100" w:line="240"/>
+      </w:pPr>
+      <w:r>
+        <w:t xml:space="preserve">Now the uncomfortable part. The spec notes that a trial run of this exercise, on this same library, went from zero crashes to finding them reliably within five iterations. Mine didn't, and I think the signal is why. Depth was the most legible number I gave the model, it moved dramatically once fixed, and so three of five rounds went into pushing it further. But nesting depth is the one dimension parson explicitly defends, with a </w:t>
+      </w:r>
+      <w:r>
+        <w:rPr>
+          <w:rFonts w:ascii="Consolas" w:cs="Consolas" w:eastAsia="Consolas" w:hAnsi="Consolas"/>
+          <w:shd w:fill="F0F0F0" w:val="clear"/>
+        </w:rPr>
+        <w:t xml:space="preserve">MAX_NESTING 2048</w:t>
+      </w:r>
+      <w:r>
+        <w:t xml:space="preserve"> guard that refuses cleanly instead of blowing the stack. The loop optimized hard toward a wall the author had already built. Meanwhile acceptance sat between 40% and 59% every round, my summary called that "healthy" every round, and a signal that keeps reporting "healthy" creates no pressure to change anything. The proxy worked as designed and steered somewhere safe.</w:t>
+      </w:r>
+    </w:p>
+    <w:p>
+      <w:pPr>
+        <w:spacing w:after="100" w:line="240"/>
+      </w:pPr>
+      <w:r>
         <w:t xml:space="preserve">Still under-tested: the harness only calls </w:t>
       </w:r>
       <w:r>
         <w:rPr>
           <w:rFonts w:ascii="Consolas" w:cs="Consolas" w:eastAsia="Consolas" w:hAnsi="Consolas"/>
-          <w:i w:val="false"/>
-          <w:iCs w:val="false"/>
           <w:shd w:fill="F0F0F0" w:val="clear"/>
         </w:rPr>
         <w:t xml:space="preserve">json_parse_string</w:t>
       </w:r>
       <w:r>
-        <w:rPr>
-          <w:i w:val="false"/>
-          <w:iCs w:val="false"/>
-        </w:rPr>
         <w:t xml:space="preserve">, so </w:t>
       </w:r>
       <w:r>
         <w:rPr>
           <w:rFonts w:ascii="Consolas" w:cs="Consolas" w:eastAsia="Consolas" w:hAnsi="Consolas"/>
-          <w:i w:val="false"/>
-          <w:iCs w:val="false"/>
           <w:shd w:fill="F0F0F0" w:val="clear"/>
         </w:rPr>
         <w:t xml:space="preserve">json_parse_file</w:t>
       </w:r>
       <w:r>
-        <w:rPr>
-          <w:i w:val="false"/>
-          <w:iCs w:val="false"/>
-        </w:rPr>
-        <w:t xml:space="preserve"> and the serialization path never ran, and mid-range nesting got little attention since the histogram clusters near the bottom and the wall.</w:t>
+        <w:t xml:space="preserve">, the </w:t>
+      </w:r>
+      <w:r>
+        <w:rPr>
+          <w:rFonts w:ascii="Consolas" w:cs="Consolas" w:eastAsia="Consolas" w:hAnsi="Consolas"/>
+          <w:shd w:fill="F0F0F0" w:val="clear"/>
+        </w:rPr>
+        <w:t xml:space="preserve">_with_comments</w:t>
+      </w:r>
+      <w:r>
+        <w:t xml:space="preserve"> entry point, and the serialization path never ran. Raw invalid UTF-8 is the most plausible remaining home for a memory bug in a byte-oriented C parser, since parson doesn't validate encoding, and it reached only about 11% of inputs from iteration 3 on. Mid-range nesting stayed thin, since the histogram clusters near the bottom and at the wall.</w:t>
       </w:r>
     </w:p>
     <w:p>
       <w:pPr>
         <w:pStyle w:val="Heading2"/>
-        <w:spacing w:after="120" w:before="240"/>
-      </w:pPr>
-      <w:r>
-        <w:rPr>
-          <w:i w:val="false"/>
-          <w:iCs w:val="false"/>
-        </w:rPr>
+        <w:spacing w:after="80" w:before="160"/>
+      </w:pPr>
+      <w:r>
         <w:t xml:space="preserve">Challenges</w:t>
       </w:r>
     </w:p>
     <w:p>
       <w:pPr>
-        <w:spacing w:after="160" w:line="264"/>
-      </w:pPr>
-      <w:r>
-        <w:rPr>
-          <w:i w:val="false"/>
-          <w:iCs w:val="false"/>
-        </w:rPr>
-        <w:t xml:space="preserve">The first run died on a </w:t>
-      </w:r>
-      <w:r>
-        <w:rPr>
-          <w:rFonts w:ascii="Consolas" w:cs="Consolas" w:eastAsia="Consolas" w:hAnsi="Consolas"/>
-          <w:i w:val="false"/>
-          <w:iCs w:val="false"/>
+        <w:spacing w:after="100" w:line="240"/>
+      </w:pPr>
+      <w:r>
+        <w:t xml:space="preserve">The first live run died on a </w:t>
+      </w:r>
+      <w:r>
+        <w:rPr>
+          <w:rFonts w:ascii="Consolas" w:cs="Consolas" w:eastAsia="Consolas" w:hAnsi="Consolas"/>
           <w:shd w:fill="F0F0F0" w:val="clear"/>
         </w:rPr>
         <w:t xml:space="preserve">JSONDecodeError</w:t>
       </w:r>
       <w:r>
-        <w:rPr>
-          <w:i w:val="false"/>
-          <w:iCs w:val="false"/>
-        </w:rPr>
-        <w:t xml:space="preserve"> that read like a parsing bug but wasn't: </w:t>
-      </w:r>
-      <w:r>
-        <w:rPr>
-          <w:rFonts w:ascii="Consolas" w:cs="Consolas" w:eastAsia="Consolas" w:hAnsi="Consolas"/>
-          <w:i w:val="false"/>
-          <w:iCs w:val="false"/>
+        <w:t xml:space="preserve"> that read like a parsing bug and wasn't. </w:t>
+      </w:r>
+      <w:r>
+        <w:rPr>
+          <w:rFonts w:ascii="Consolas" w:cs="Consolas" w:eastAsia="Consolas" w:hAnsi="Consolas"/>
           <w:shd w:fill="F0F0F0" w:val="clear"/>
         </w:rPr>
         <w:t xml:space="preserve">max_tokens</w:t>
       </w:r>
       <w:r>
-        <w:rPr>
-          <w:i w:val="false"/>
-          <w:iCs w:val="false"/>
-        </w:rPr>
-        <w:t xml:space="preserve"> was too low, adaptive thinking plus a full strategy blew past it, and the response got cut off mid-string. Raising the cap and checking </w:t>
-      </w:r>
-      <w:r>
-        <w:rPr>
-          <w:rFonts w:ascii="Consolas" w:cs="Consolas" w:eastAsia="Consolas" w:hAnsi="Consolas"/>
-          <w:i w:val="false"/>
-          <w:iCs w:val="false"/>
+        <w:t xml:space="preserve"> was too low, adaptive thinking plus a full strategy module blew past it, and the response arrived truncated mid-string. Raising the cap and checking </w:t>
+      </w:r>
+      <w:r>
+        <w:rPr>
+          <w:rFonts w:ascii="Consolas" w:cs="Consolas" w:eastAsia="Consolas" w:hAnsi="Consolas"/>
           <w:shd w:fill="F0F0F0" w:val="clear"/>
         </w:rPr>
         <w:t xml:space="preserve">stop_reason</w:t>
       </w:r>
       <w:r>
-        <w:rPr>
-          <w:i w:val="false"/>
-          <w:iCs w:val="false"/>
-        </w:rPr>
-        <w:t xml:space="preserve"> before parsing fixed it.</w:t>
-      </w:r>
-    </w:p>
-    <w:p>
-      <w:pPr>
-        <w:spacing w:after="160" w:line="264"/>
-      </w:pPr>
-      <w:r>
-        <w:rPr>
-          <w:i w:val="false"/>
-          <w:iCs w:val="false"/>
-        </w:rPr>
-        <w:t xml:space="preserve">Deduplication hashes the top three stack frames after stripping addresses and libc noise, with every normalization choice documented in </w:t>
-      </w:r>
-      <w:r>
-        <w:rPr>
-          <w:rFonts w:ascii="Consolas" w:cs="Consolas" w:eastAsia="Consolas" w:hAnsi="Consolas"/>
-          <w:i w:val="false"/>
-          <w:iCs w:val="false"/>
+        <w:t xml:space="preserve"> before parsing fixed it, at the cost of one wasted call.</w:t>
+      </w:r>
+    </w:p>
+    <w:p>
+      <w:pPr>
+        <w:spacing w:after="100" w:line="240"/>
+      </w:pPr>
+      <w:r>
+        <w:t xml:space="preserve">Three judgment calls worth stating outright. Deduplication hashes the top three symbolized frames after stripping addresses, libc noise, and bare integers, every choice documented in </w:t>
+      </w:r>
+      <w:r>
+        <w:rPr>
+          <w:rFonts w:ascii="Consolas" w:cs="Consolas" w:eastAsia="Consolas" w:hAnsi="Consolas"/>
           <w:shd w:fill="F0F0F0" w:val="clear"/>
         </w:rPr>
         <w:t xml:space="preserve">fuzzer/triage.py</w:t>
       </w:r>
       <w:r>
-        <w:rPr>
-          <w:i w:val="false"/>
-          <w:iCs w:val="false"/>
-        </w:rPr>
-        <w:t xml:space="preserve">. It never ran against a real crash here though, only the toy target, so I can't call it battle-tested.</w:t>
-      </w:r>
-    </w:p>
-    <w:p>
-      <w:pPr>
-        <w:spacing w:after="160" w:line="264"/>
-      </w:pPr>
-      <w:r>
-        <w:rPr>
-          <w:i w:val="false"/>
-          <w:iCs w:val="false"/>
-        </w:rPr>
-        <w:t xml:space="preserve">One deliberate call: the harness frees the input buffer before the parse tree, so a retained pointer into it would show up as a genuine use-after-free instead of getting masked. Nothing tripped it, a small positive sign for parson's lifetime handling.</w:t>
-      </w:r>
-    </w:p>
-    <w:p>
-      <w:pPr>
-        <w:spacing w:after="160" w:line="264"/>
-      </w:pPr>
-      <w:r>
-        <w:rPr>
-          <w:i w:val="false"/>
-          <w:iCs w:val="false"/>
-        </w:rPr>
-        <w:t xml:space="preserve">With more time or coverage available, I'd try differential testing against a second JSON parser first (disagreement is a denser signal than crashing and catches correctness bugs a sanitizer never will), then spend more budget at the byte level, since parson doesn't validate UTF-8 and that's the most plausible place left for a memory bug in a byte-oriented C parser.</w:t>
-      </w:r>
-    </w:p>
-    <w:p>
-      <w:pPr>
-        <w:pBdr>
-          <w:bottom w:val="single" w:color="999999" w:sz="6" w:space="1"/>
-        </w:pBdr>
-        <w:spacing w:after="200" w:before="200"/>
-      </w:pPr>
-    </w:p>
-    <w:p>
-      <w:pPr>
-        <w:spacing w:after="160" w:line="264"/>
+        <w:t xml:space="preserve">; it never ran against a real JSON crash, only the toy target, so I can't call it battle-tested. Timeouts count as crashes and take the same triage path as a sanitizer abort, the right policy even though nothing came near tripping it. And the harness deliberately frees the input buffer before the parse tree, so a retained pointer into it would surface as a genuine use-after-free rather than being masked. Nothing tripped that either, a small positive signal about parson's lifetime handling.</w:t>
+      </w:r>
+    </w:p>
+    <w:p>
+      <w:pPr>
+        <w:spacing w:after="100" w:line="240"/>
+      </w:pPr>
+      <w:r>
+        <w:t xml:space="preserve">With more time I'd widen the harness past a single entry point and try differential testing against a second JSON parser: disagreement is a denser signal than crashing, and catches correctness bugs a sanitizer never will. With coverage available, the failure above wouldn't have happened at all: it would have shown iterations 2 through 4 re-walking the same lines at ever-greater depth, and the pressure to look elsewhere would have arrived on round three instead of in this paragraph.</w:t>
+      </w:r>
+    </w:p>
+    <w:p>
+      <w:pPr>
+        <w:spacing w:after="100" w:line="240"/>
       </w:pPr>
       <w:r>
         <w:rPr>
           <w:i/>
           <w:iCs/>
         </w:rPr>
-        <w:t xml:space="preserve">Artifacts: </w:t>
+        <w:t xml:space="preserve">Artifacts under </w:t>
       </w:r>
       <w:r>
         <w:rPr>
@@ -938,14 +807,14 @@
           <w:iCs/>
           <w:shd w:fill="F0F0F0" w:val="clear"/>
         </w:rPr>
-        <w:t xml:space="preserve">grammar/json-parson/</w:t>
+        <w:t xml:space="preserve">json-parson/</w:t>
       </w:r>
       <w:r>
         <w:rPr>
           <w:i/>
           <w:iCs/>
         </w:rPr>
-        <w:t xml:space="preserve">, </w:t>
+        <w:t xml:space="preserve">: </w:t>
       </w:r>
       <w:r>
         <w:rPr>
@@ -954,7 +823,7 @@
           <w:iCs/>
           <w:shd w:fill="F0F0F0" w:val="clear"/>
         </w:rPr>
-        <w:t xml:space="preserve">target/json-parson/</w:t>
+        <w:t xml:space="preserve">grammar/</w:t>
       </w:r>
       <w:r>
         <w:rPr>
@@ -970,7 +839,7 @@
           <w:iCs/>
           <w:shd w:fill="F0F0F0" w:val="clear"/>
         </w:rPr>
-        <w:t xml:space="preserve">strategies/json-parson/</w:t>
+        <w:t xml:space="preserve">target/</w:t>
       </w:r>
       <w:r>
         <w:rPr>
@@ -986,7 +855,7 @@
           <w:iCs/>
           <w:shd w:fill="F0F0F0" w:val="clear"/>
         </w:rPr>
-        <w:t xml:space="preserve">logs/json-parson/</w:t>
+        <w:t xml:space="preserve">strategies/</w:t>
       </w:r>
       <w:r>
         <w:rPr>
@@ -1002,7 +871,23 @@
           <w:iCs/>
           <w:shd w:fill="F0F0F0" w:val="clear"/>
         </w:rPr>
-        <w:t xml:space="preserve">crashes/json-parson/NONE_FOUND.md</w:t>
+        <w:t xml:space="preserve">logs/</w:t>
+      </w:r>
+      <w:r>
+        <w:rPr>
+          <w:i/>
+          <w:iCs/>
+        </w:rPr>
+        <w:t xml:space="preserve">, </w:t>
+      </w:r>
+      <w:r>
+        <w:rPr>
+          <w:rFonts w:ascii="Consolas" w:cs="Consolas" w:eastAsia="Consolas" w:hAnsi="Consolas"/>
+          <w:i/>
+          <w:iCs/>
+          <w:shd w:fill="F0F0F0" w:val="clear"/>
+        </w:rPr>
+        <w:t xml:space="preserve">crashes/</w:t>
       </w:r>
       <w:r>
         <w:rPr>
@@ -1201,8 +1086,8 @@
     <w:rPrDefault>
       <w:rPr>
         <w:rFonts w:ascii="Georgia" w:cs="Georgia" w:eastAsia="Georgia" w:hAnsi="Georgia"/>
-        <w:sz w:val="22"/>
-        <w:szCs w:val="22"/>
+        <w:sz w:val="21"/>
+        <w:szCs w:val="21"/>
       </w:rPr>
     </w:rPrDefault>
     <w:pPrDefault/>
@@ -1386,8 +1271,8 @@
       <w:rFonts w:ascii="Georgia" w:cs="Georgia" w:eastAsia="Georgia" w:hAnsi="Georgia"/>
       <w:b/>
       <w:bCs/>
-      <w:sz w:val="30"/>
-      <w:szCs w:val="30"/>
+      <w:sz w:val="28"/>
+      <w:szCs w:val="28"/>
     </w:rPr>
   </w:style>
   <w:style w:type="paragraph" w:styleId="Heading2">
@@ -1398,8 +1283,8 @@
       <w:rFonts w:ascii="Georgia" w:cs="Georgia" w:eastAsia="Georgia" w:hAnsi="Georgia"/>
       <w:b/>
       <w:bCs/>
-      <w:sz w:val="26"/>
-      <w:szCs w:val="26"/>
+      <w:sz w:val="25"/>
+      <w:szCs w:val="25"/>
     </w:rPr>
   </w:style>
   <w:style w:type="paragraph" w:styleId="Heading3">

</xml_diff>

<commit_message>
docs: keep the Word edit to the opening line, fix its grammar
Word had the file locked during the last commit. Comparing it against
HEAD afterwards showed two real hand-edits in the opening paragraph,
both kept: an added comma before 'and the real parser', and 'dies'
changed to 'crushes'.

'crushes' is transitive, so an input cannot crush by itself. Made it
'gets crushed', which keeps the intended word. Everything else that
looked changed was Word re-encoding &quot; back to a literal quote.

report.md now matches the docx. Still two pages, schema validated.
</commit_message>
<xml_diff>
--- a/report/report.docx
+++ b/report/report.docx
@@ -24,7 +24,6 @@
     </w:p>
     <w:p>
       <w:pPr>
-        <w:spacing w:after="100"/>
         <w:jc w:val="both"/>
         <w:rPr>
           <w:rFonts w:ascii="Times New Roman" w:hAnsi="Times New Roman" w:cs="Times New Roman"/>
@@ -89,7 +88,6 @@
     </w:p>
     <w:p>
       <w:pPr>
-        <w:spacing w:after="100"/>
         <w:jc w:val="both"/>
         <w:rPr>
           <w:rFonts w:ascii="Times New Roman" w:hAnsi="Times New Roman" w:cs="Times New Roman"/>
@@ -122,15 +120,34 @@
           <w:szCs w:val="22"/>
           <w:shd w:val="clear" w:color="auto" w:fill="F0F0F0"/>
         </w:rPr>
-        <w:t>json/JSON.g4</w:t>
-      </w:r>
-      <w:r>
-        <w:rPr>
-          <w:rFonts w:ascii="Times New Roman" w:hAnsi="Times New Roman" w:cs="Times New Roman"/>
-          <w:sz w:val="22"/>
-          <w:szCs w:val="22"/>
-        </w:rPr>
-        <w:t xml:space="preserve"> @ </w:t>
+        <w:t>json/JSON.</w:t>
+      </w:r>
+      <w:proofErr w:type="gramStart"/>
+      <w:r>
+        <w:rPr>
+          <w:rFonts w:ascii="Times New Roman" w:eastAsia="Consolas" w:hAnsi="Times New Roman" w:cs="Times New Roman"/>
+          <w:sz w:val="22"/>
+          <w:szCs w:val="22"/>
+          <w:shd w:val="clear" w:color="auto" w:fill="F0F0F0"/>
+        </w:rPr>
+        <w:t>g4</w:t>
+      </w:r>
+      <w:r>
+        <w:rPr>
+          <w:rFonts w:ascii="Times New Roman" w:hAnsi="Times New Roman" w:cs="Times New Roman"/>
+          <w:sz w:val="22"/>
+          <w:szCs w:val="22"/>
+        </w:rPr>
+        <w:t xml:space="preserve"> @</w:t>
+      </w:r>
+      <w:proofErr w:type="gramEnd"/>
+      <w:r>
+        <w:rPr>
+          <w:rFonts w:ascii="Times New Roman" w:hAnsi="Times New Roman" w:cs="Times New Roman"/>
+          <w:sz w:val="22"/>
+          <w:szCs w:val="22"/>
+        </w:rPr>
+        <w:t xml:space="preserve"> </w:t>
       </w:r>
       <w:r>
         <w:rPr>
@@ -152,7 +169,6 @@
     </w:p>
     <w:p>
       <w:pPr>
-        <w:spacing w:after="100"/>
         <w:jc w:val="both"/>
         <w:rPr>
           <w:rFonts w:ascii="Times New Roman" w:hAnsi="Times New Roman" w:cs="Times New Roman"/>
@@ -215,7 +231,39 @@
           <w:sz w:val="22"/>
           <w:szCs w:val="22"/>
         </w:rPr>
-        <w:t xml:space="preserve">Fuzzing a parser is easy to do badly. Throw random bytes at a JSON library and nearly every input dies in the first few characters, so the tokenizer gets tested thousands of times and the real parser almost never does. The usual fix is to generate inputs already shaped like the format, which is what a formal grammar gives you for free.</w:t>
+        <w:t xml:space="preserve">Fuzzing a parser is easy to do badly. Throw random bytes at a JSON library and nearly every input </w:t>
+      </w:r>
+      <w:r>
+        <w:rPr>
+          <w:rFonts w:ascii="Times New Roman" w:hAnsi="Times New Roman" w:cs="Times New Roman"/>
+          <w:sz w:val="22"/>
+          <w:szCs w:val="22"/>
+        </w:rPr>
+        <w:t>gets crushed</w:t>
+      </w:r>
+      <w:r>
+        <w:rPr>
+          <w:rFonts w:ascii="Times New Roman" w:hAnsi="Times New Roman" w:cs="Times New Roman"/>
+          <w:sz w:val="22"/>
+          <w:szCs w:val="22"/>
+        </w:rPr>
+        <w:t xml:space="preserve"> in the first few characters, so the tokenizer gets tested thousands of </w:t>
+      </w:r>
+      <w:r>
+        <w:rPr>
+          <w:rFonts w:ascii="Times New Roman" w:hAnsi="Times New Roman" w:cs="Times New Roman"/>
+          <w:sz w:val="22"/>
+          <w:szCs w:val="22"/>
+        </w:rPr>
+        <w:t>times,</w:t>
+      </w:r>
+      <w:r>
+        <w:rPr>
+          <w:rFonts w:ascii="Times New Roman" w:hAnsi="Times New Roman" w:cs="Times New Roman"/>
+          <w:sz w:val="22"/>
+          <w:szCs w:val="22"/>
+        </w:rPr>
+        <w:t xml:space="preserve"> and the real parser almost never does. The usual fix is to generate inputs already shaped like the format, which is what a formal grammar gives you for free.</w:t>
       </w:r>
     </w:p>
     <w:p>
@@ -234,7 +282,7 @@
           <w:sz w:val="22"/>
           <w:szCs w:val="22"/>
         </w:rPr>
-        <w:t xml:space="preserve">In this assignment, I wasn't allowed to write that generator myself. An LLM had to read the grammar and write the Hypothesis strategy. I'd run its output through a sanitizer build of the real C library and feed the measurements back so it could revise, for five rounds or five dollars, whichever ran out first. I also couldn't instrument the target for coverage, which is normally how you'd know if a generator got better. So my actual problem wasn't whether an LLM could write a grammar-based generator. It could, on the first try. It was what to show in round two.</w:t>
+        <w:t>In this assignment, I wasn't allowed to write that generator myself. An LLM had to read the grammar and write the Hypothesis strategy. I'd run its output through a sanitizer build of the real C library and feed the measurements back so it could revise, for five rounds or five dollars, whichever ran out first. I also couldn't instrument the target for coverage, which is normally how you'd know if a generator got better. So my actual problem wasn't whether an LLM could write a grammar-based generator. It could, on the first try. It was what to show in round two.</w:t>
       </w:r>
     </w:p>
     <w:p>
@@ -300,7 +348,7 @@
           <w:sz w:val="22"/>
           <w:szCs w:val="22"/>
         </w:rPr>
-        <w:t xml:space="preserve">). parson accepts things the grammar forbids (a trailing comma, anything after the first value) and rejects things it allows (duplicate keys, lone surrogates, exponents that overflow a double). It caps nesting at 2049 for arrays and 2048 for objects. That one-level split isn't noise, it holds on every run. They go in beside the grammar, because a generator emitting only grammar-legal text never reaches the superset paths.</w:t>
+        <w:t>). parson accepts things the grammar forbids (a trailing comma, anything after the first value) and rejects things it allows (duplicate keys, lone surrogates, exponents that overflow a double). It caps nesting at 2049 for arrays and 2048 for objects. That one-level split isn't noise, it holds on every run. They go in beside the grammar, because a generator emitting only grammar-legal text never reaches the superset paths.</w:t>
       </w:r>
     </w:p>
     <w:p>
@@ -465,7 +513,7 @@
           <w:sz w:val="22"/>
           <w:szCs w:val="22"/>
         </w:rPr>
-        <w:t xml:space="preserve">parson survived all 2,500 inputs under ASan and UBSan with zero crashes. That isn't a broken pipeline: the crash path was validated first against a toy parser with three planted bugs, all caught, deduplicated, and minimized correctly (</w:t>
+        <w:t>parson survived all 2,500 inputs under ASan and UBSan with zero crashes. That isn't a broken pipeline: the crash path was validated first against a toy parser with three planted bugs, all caught, deduplicated, and minimized correctly (</w:t>
       </w:r>
       <w:r>
         <w:rPr>
@@ -1306,7 +1354,7 @@
           <w:sz w:val="22"/>
           <w:szCs w:val="22"/>
         </w:rPr>
-        <w:t xml:space="preserve">The first live run crashed with a JSONDecodeError. At first that looked like a bug in the parser, but it wasn't. The token limit I'd set was too low, and once adaptive thinking plus a full strategy module used up that budget, the response got cut off in the middle of a string. Raising the limit and checking the stop reason before trying to parse the response fixed it, though it cost one wasted API call to find.</w:t>
+        <w:t>The first live run crashed with a JSONDecodeError. At first that looked like a bug in the parser, but it wasn't. The token limit I'd set was too low, and once adaptive thinking plus a full strategy module used up that budget, the response got cut off in the middle of a string. Raising the limit and checking the stop reason before trying to parse the response fixed it, though it cost one wasted API call to find.</w:t>
       </w:r>
     </w:p>
     <w:p>
@@ -1325,7 +1373,7 @@
           <w:sz w:val="22"/>
           <w:szCs w:val="22"/>
         </w:rPr>
-        <w:t xml:space="preserve">Three judgment calls are worth explaining. First, deduplication: I group crashes by hashing their top three stack frames, after stripping out addresses and library noise. That logic is documented in fuzzer/triage.py. It was never tested against a real JSON crash here, since parson never crashed, but the same method was tested on a real crash in the companion TOML report, where it revealed a real weakness: it over-counts stack-overflow bugs, splitting one root cause into four signatures. Second, timeouts: a hang counts as a crash, the same as a sanitizer abort. That's the right call, even though nothing here ever came close to timing out. Third, the harness frees the input buffer before touching the parse tree, on purpose. If parson ever kept a pointer into that freed memory, this would catch it as a real use-after-free instead of hiding it. Nothing tripped that check either, which is a small good sign for how parson manages memory.</w:t>
+        <w:t>Three judgment calls are worth explaining. First, deduplication: I group crashes by hashing their top three stack frames, after stripping out addresses and library noise. That logic is documented in fuzzer/triage.py. It was never tested against a real JSON crash here, since parson never crashed, but the same method was tested on a real crash in the companion TOML report, where it revealed a real weakness: it over-counts stack-overflow bugs, splitting one root cause into four signatures. Second, timeouts: a hang counts as a crash, the same as a sanitizer abort. That's the right call, even though nothing here ever came close to timing out. Third, the harness frees the input buffer before touching the parse tree, on purpose. If parson ever kept a pointer into that freed memory, this would catch it as a real use-after-free instead of hiding it. Nothing tripped that check either, which is a small good sign for how parson manages memory.</w:t>
       </w:r>
     </w:p>
     <w:p>
@@ -1344,7 +1392,7 @@
           <w:sz w:val="22"/>
           <w:szCs w:val="22"/>
         </w:rPr>
-        <w:t xml:space="preserve">With more time I'd widen the harness past a single entry point and try differential testing against a second JSON parser: disagreement is a denser signal than crashing, and catches correctness bugs a sanitizer never will. With coverage available, the failure above wouldn't have happened at all: it would have shown iterations 2 through 4 re-walking the same lines at ever-greater depth, and the pressure to look elsewhere would have arrived on round three instead of in this paragraph.</w:t>
+        <w:t>With more time I'd widen the harness past a single entry point and try differential testing against a second JSON parser: disagreement is a denser signal than crashing, and catches correctness bugs a sanitizer never will. With coverage available, the failure above wouldn't have happened at all: it would have shown iterations 2 through 4 re-walking the same lines at ever-greater depth, and the pressure to look elsewhere would have arrived on round three instead of in this paragraph.</w:t>
       </w:r>
     </w:p>
     <w:p>
@@ -2265,6 +2313,7 @@
   <w:style w:type="character" w:default="1" w:styleId="DefaultParagraphFont">
     <w:name w:val="Default Paragraph Font"/>
     <w:uiPriority w:val="1"/>
+    <w:semiHidden/>
     <w:unhideWhenUsed/>
   </w:style>
   <w:style w:type="table" w:default="1" w:styleId="TableNormal">

</xml_diff>

<commit_message>
docs: finalize both reports with your revision pass
Both docx files carried a full round of your own hand-edits (word
choices, tightened sentences, one dropped paragraph). Synced both
markdown sources to match exactly, verified against the docx text
directly rather than assumed.

report-toml-tomlc99: removed the cost-breakdown paragraph from
Challenges per your call; the budget figure stays in the header stat
line. Also caught and fixed a grammar-path typo mid-edit (the TomlLexer
reference briefly lost its toml/ prefix), confirmed against the actual
file names in grammar/toml-tomlc99/.

Both still render to exactly two pages, zero em dashes, schema intact.
report-toml-tomlc99.docx is locked (open in Word) and follows in a
separate commit.
</commit_message>
<xml_diff>
--- a/report/report.docx
+++ b/report/report.docx
@@ -282,7 +282,23 @@
           <w:sz w:val="22"/>
           <w:szCs w:val="22"/>
         </w:rPr>
-        <w:t>In this assignment, I wasn't allowed to write that generator myself. An LLM had to read the grammar and write the Hypothesis strategy. I'd run its output through a sanitizer build of the real C library and feed the measurements back so it could revise, for five rounds or five dollars, whichever ran out first. I also couldn't instrument the target for coverage, which is normally how you'd know if a generator got better. So my actual problem wasn't whether an LLM could write a grammar-based generator. It could, on the first try. It was what to show in round two.</w:t>
+        <w:t xml:space="preserve">In this assignment, I wasn't allowed to write that generator myself. An </w:t>
+      </w:r>
+      <w:r>
+        <w:rPr>
+          <w:rFonts w:ascii="Times New Roman" w:hAnsi="Times New Roman" w:cs="Times New Roman"/>
+          <w:sz w:val="22"/>
+          <w:szCs w:val="22"/>
+        </w:rPr>
+        <w:t>LLM (Large Language Model)</w:t>
+      </w:r>
+      <w:r>
+        <w:rPr>
+          <w:rFonts w:ascii="Times New Roman" w:hAnsi="Times New Roman" w:cs="Times New Roman"/>
+          <w:sz w:val="22"/>
+          <w:szCs w:val="22"/>
+        </w:rPr>
+        <w:t xml:space="preserve"> had to read the grammar and write the Hypothesis strategy. I'd run its output through a sanitizer build of the real C library and feed the measurements back so it could revise, for five rounds or five dollars, whichever ran out first. I also couldn't instrument the target for coverage, which is normally how you'd know if a generator got better. So my actual problem wasn't whether an LLM could write a grammar-based generator. It could, on the first try. It was what to show in round two.</w:t>
       </w:r>
     </w:p>
     <w:p>
@@ -331,7 +347,71 @@
           <w:sz w:val="22"/>
           <w:szCs w:val="22"/>
         </w:rPr>
-        <w:t xml:space="preserve"> The 77-line JSON grammar goes into the prompt whole, since summarizing risks quietly dropping a production. But the grammar describes JSON in the abstract, not parson, and the gap between the two is where the real parsing code lives. Rather than guess, I measured it: 33 boundary inputs plus a bisection against the sanitizer build (</w:t>
+        <w:t xml:space="preserve"> The 77-line JSON grammar goes into the prompt whole, </w:t>
+      </w:r>
+      <w:r>
+        <w:rPr>
+          <w:rFonts w:ascii="Times New Roman" w:hAnsi="Times New Roman" w:cs="Times New Roman"/>
+          <w:sz w:val="22"/>
+          <w:szCs w:val="22"/>
+        </w:rPr>
+        <w:t>because</w:t>
+      </w:r>
+      <w:r>
+        <w:rPr>
+          <w:rFonts w:ascii="Times New Roman" w:hAnsi="Times New Roman" w:cs="Times New Roman"/>
+          <w:sz w:val="22"/>
+          <w:szCs w:val="22"/>
+        </w:rPr>
+        <w:t xml:space="preserve"> summarizing risks quietly dropping a production.</w:t>
+      </w:r>
+      <w:r>
+        <w:rPr>
+          <w:rFonts w:ascii="Times New Roman" w:hAnsi="Times New Roman" w:cs="Times New Roman"/>
+          <w:sz w:val="22"/>
+          <w:szCs w:val="22"/>
+        </w:rPr>
+        <w:t xml:space="preserve"> The</w:t>
+      </w:r>
+      <w:r>
+        <w:rPr>
+          <w:rFonts w:ascii="Times New Roman" w:hAnsi="Times New Roman" w:cs="Times New Roman"/>
+          <w:sz w:val="22"/>
+          <w:szCs w:val="22"/>
+        </w:rPr>
+        <w:t xml:space="preserve"> </w:t>
+      </w:r>
+      <w:r>
+        <w:rPr>
+          <w:rFonts w:ascii="Times New Roman" w:hAnsi="Times New Roman" w:cs="Times New Roman"/>
+          <w:sz w:val="22"/>
+          <w:szCs w:val="22"/>
+        </w:rPr>
+        <w:t>Grammar</w:t>
+      </w:r>
+      <w:r>
+        <w:rPr>
+          <w:rFonts w:ascii="Times New Roman" w:hAnsi="Times New Roman" w:cs="Times New Roman"/>
+          <w:sz w:val="22"/>
+          <w:szCs w:val="22"/>
+        </w:rPr>
+        <w:t xml:space="preserve"> defines JSON as an idea. parson is one programmer's actual implementation of it. Wherever those two disagree is exactly where real code had to be written to handle the </w:t>
+      </w:r>
+      <w:r>
+        <w:rPr>
+          <w:rFonts w:ascii="Times New Roman" w:hAnsi="Times New Roman" w:cs="Times New Roman"/>
+          <w:sz w:val="22"/>
+          <w:szCs w:val="22"/>
+        </w:rPr>
+        <w:t>difference.</w:t>
+      </w:r>
+      <w:r>
+        <w:rPr>
+          <w:rFonts w:ascii="Times New Roman" w:hAnsi="Times New Roman" w:cs="Times New Roman"/>
+          <w:sz w:val="22"/>
+          <w:szCs w:val="22"/>
+        </w:rPr>
+        <w:t xml:space="preserve"> Rather than guess, I measured it: 33 boundary inputs plus a bisection against the sanitizer build (</w:t>
       </w:r>
       <w:r>
         <w:rPr>
@@ -377,7 +457,23 @@
           <w:sz w:val="22"/>
           <w:szCs w:val="22"/>
         </w:rPr>
-        <w:t xml:space="preserve"> The hardest thing to get right is what counts as a bug, because "invalid input" is the parser working correctly. The harness reads stdin, calls </w:t>
+        <w:t xml:space="preserve"> </w:t>
+      </w:r>
+      <w:r>
+        <w:rPr>
+          <w:rFonts w:ascii="Times New Roman" w:hAnsi="Times New Roman" w:cs="Times New Roman"/>
+          <w:sz w:val="22"/>
+          <w:szCs w:val="22"/>
+        </w:rPr>
+        <w:t>Not every failure is a bug. Rejecting bad input is the parser working correctly, so the real challenge is drawing the line between that and an actual crash</w:t>
+      </w:r>
+      <w:r>
+        <w:rPr>
+          <w:rFonts w:ascii="Times New Roman" w:hAnsi="Times New Roman" w:cs="Times New Roman"/>
+          <w:sz w:val="22"/>
+          <w:szCs w:val="22"/>
+        </w:rPr>
+        <w:t xml:space="preserve">. The harness reads stdin, calls </w:t>
       </w:r>
       <w:r>
         <w:rPr>
@@ -411,41 +507,53 @@
           <w:sz w:val="22"/>
           <w:szCs w:val="22"/>
         </w:rPr>
-        <w:t xml:space="preserve">, 2 if the harness itself fails. Anything else, a fatal signal or sanitizer abort, is a real bug. The build supplies the abort: ASan and UBSan with </w:t>
-      </w:r>
-      <w:r>
-        <w:rPr>
-          <w:rFonts w:ascii="Times New Roman" w:eastAsia="Consolas" w:hAnsi="Times New Roman" w:cs="Times New Roman"/>
-          <w:sz w:val="22"/>
-          <w:szCs w:val="22"/>
-          <w:shd w:val="clear" w:color="auto" w:fill="F0F0F0"/>
-        </w:rPr>
-        <w:t>-fno-sanitize-recover=all</w:t>
-      </w:r>
-      <w:r>
-        <w:rPr>
-          <w:rFonts w:ascii="Times New Roman" w:hAnsi="Times New Roman" w:cs="Times New Roman"/>
-          <w:sz w:val="22"/>
-          <w:szCs w:val="22"/>
-        </w:rPr>
-        <w:t xml:space="preserve">, so undefined behavior stops the process instead of continuing quietly. One trap silently destroys the experiment: ASan's default exit code is 1, identical to the reject code, so without </w:t>
-      </w:r>
-      <w:r>
-        <w:rPr>
-          <w:rFonts w:ascii="Times New Roman" w:eastAsia="Consolas" w:hAnsi="Times New Roman" w:cs="Times New Roman"/>
-          <w:sz w:val="22"/>
-          <w:szCs w:val="22"/>
-          <w:shd w:val="clear" w:color="auto" w:fill="F0F0F0"/>
-        </w:rPr>
-        <w:t>ASAN_OPTIONS=abort_on_error=1</w:t>
-      </w:r>
-      <w:r>
-        <w:rPr>
-          <w:rFonts w:ascii="Times New Roman" w:hAnsi="Times New Roman" w:cs="Times New Roman"/>
-          <w:sz w:val="22"/>
-          <w:szCs w:val="22"/>
-        </w:rPr>
-        <w:t xml:space="preserve"> every memory bug gets filed as a polite rejection. Timeouts get 5 seconds and are triaged as crashes, since a parser that hangs is a denial-of-service bug, not a pass.</w:t>
+        <w:t xml:space="preserve">, 2 if the harness itself fails. Anything else, a fatal signal or sanitizer abort, is a real bug. </w:t>
+      </w:r>
+      <w:r>
+        <w:rPr>
+          <w:rFonts w:ascii="Times New Roman" w:hAnsi="Times New Roman" w:cs="Times New Roman"/>
+          <w:sz w:val="22"/>
+          <w:szCs w:val="22"/>
+        </w:rPr>
+        <w:t>The build compiles with ASan and UBSan, plus -fno-sanitize-recover=all, so the moment something undefined happens, the process dies immediately instead of silently limping forward</w:t>
+      </w:r>
+      <w:r>
+        <w:rPr>
+          <w:rFonts w:ascii="Times New Roman" w:hAnsi="Times New Roman" w:cs="Times New Roman"/>
+          <w:sz w:val="22"/>
+          <w:szCs w:val="22"/>
+        </w:rPr>
+        <w:t>.</w:t>
+      </w:r>
+      <w:r>
+        <w:t xml:space="preserve"> </w:t>
+      </w:r>
+      <w:r>
+        <w:t>A</w:t>
+      </w:r>
+      <w:r>
+        <w:rPr>
+          <w:rFonts w:ascii="Times New Roman" w:hAnsi="Times New Roman" w:cs="Times New Roman"/>
+          <w:sz w:val="22"/>
+          <w:szCs w:val="22"/>
+        </w:rPr>
+        <w:t xml:space="preserve">San's default exit code is 1, the same code the harness uses for a clean rejection, so I set ASAN_OPTIONS=abort_on_error=1 to keep every real memory bug from being misfiled as ordinary invalid </w:t>
+      </w:r>
+      <w:r>
+        <w:rPr>
+          <w:rFonts w:ascii="Times New Roman" w:hAnsi="Times New Roman" w:cs="Times New Roman"/>
+          <w:sz w:val="22"/>
+          <w:szCs w:val="22"/>
+        </w:rPr>
+        <w:t>input.</w:t>
+      </w:r>
+      <w:r>
+        <w:rPr>
+          <w:rFonts w:ascii="Times New Roman" w:hAnsi="Times New Roman" w:cs="Times New Roman"/>
+          <w:sz w:val="22"/>
+          <w:szCs w:val="22"/>
+        </w:rPr>
+        <w:t xml:space="preserve"> Timeouts get 5 seconds and are triaged as crashes, since a parser that hangs is a denial-of-service bug, not a pass.</w:t>
       </w:r>
     </w:p>
     <w:p>
@@ -474,7 +582,79 @@
           <w:sz w:val="22"/>
           <w:szCs w:val="22"/>
         </w:rPr>
-        <w:t xml:space="preserve"> Each round prompts the model, saves the module, sanity-checks a dozen examples to catch one that won't even import, runs 500 inputs through the harness, and hands the summary back. With coverage off the table, three measurements stand in: acceptance rate, production coverage (each strategy declares which grammar rule it's expanding), and nesting depth. I chose those three because they map onto the three ways a grammar-derived generator usually fails: it bounces off the tokenizer, it silently never reaches some rules, or its recursion is cosmetic and everything comes out flat. All three live in the generator, not the target, so they cost nothing and break no rules.</w:t>
+        <w:t xml:space="preserve"> Each round prompts the model, saves the module, sanity-checks a dozen examples to catch one that won't even import, runs 500 inputs through the harness, and hands the summary back. </w:t>
+      </w:r>
+      <w:r>
+        <w:rPr>
+          <w:rFonts w:ascii="Times New Roman" w:hAnsi="Times New Roman" w:cs="Times New Roman"/>
+          <w:sz w:val="22"/>
+          <w:szCs w:val="22"/>
+        </w:rPr>
+        <w:t xml:space="preserve">In place of coverage, I tracked three things instead: how often inputs got accepted, which grammar rules were </w:t>
+      </w:r>
+      <w:r>
+        <w:rPr>
+          <w:rFonts w:ascii="Times New Roman" w:hAnsi="Times New Roman" w:cs="Times New Roman"/>
+          <w:sz w:val="22"/>
+          <w:szCs w:val="22"/>
+        </w:rPr>
+        <w:t>being</w:t>
+      </w:r>
+      <w:r>
+        <w:rPr>
+          <w:rFonts w:ascii="Times New Roman" w:hAnsi="Times New Roman" w:cs="Times New Roman"/>
+          <w:sz w:val="22"/>
+          <w:szCs w:val="22"/>
+        </w:rPr>
+        <w:t xml:space="preserve"> exercised (each strategy self-reports this), and </w:t>
+      </w:r>
+      <w:r>
+        <w:rPr>
+          <w:rFonts w:ascii="Times New Roman" w:hAnsi="Times New Roman" w:cs="Times New Roman"/>
+          <w:sz w:val="22"/>
+          <w:szCs w:val="22"/>
+        </w:rPr>
+        <w:t>nesting depth</w:t>
+      </w:r>
+      <w:r>
+        <w:rPr>
+          <w:rFonts w:ascii="Times New Roman" w:hAnsi="Times New Roman" w:cs="Times New Roman"/>
+          <w:sz w:val="22"/>
+          <w:szCs w:val="22"/>
+        </w:rPr>
+        <w:t xml:space="preserve">. </w:t>
+      </w:r>
+      <w:r>
+        <w:rPr>
+          <w:rFonts w:ascii="Times New Roman" w:hAnsi="Times New Roman" w:cs="Times New Roman"/>
+          <w:sz w:val="22"/>
+          <w:szCs w:val="22"/>
+        </w:rPr>
+        <w:t>Those three signals were chosen because together they cover the usual failure modes of a grammar-derived generator</w:t>
+      </w:r>
+      <w:r>
+        <w:rPr>
+          <w:rFonts w:ascii="Times New Roman" w:hAnsi="Times New Roman" w:cs="Times New Roman"/>
+          <w:sz w:val="22"/>
+          <w:szCs w:val="22"/>
+        </w:rPr>
+        <w:t xml:space="preserve">: it bounces off the tokenizer, it silently never reaches some rules, or its recursion is cosmetic and everything comes out flat. </w:t>
+      </w:r>
+      <w:r>
+        <w:rPr>
+          <w:rFonts w:ascii="Times New Roman" w:hAnsi="Times New Roman" w:cs="Times New Roman"/>
+          <w:sz w:val="22"/>
+          <w:szCs w:val="22"/>
+        </w:rPr>
+        <w:t>Since none of them require touching the target, they come free and stay inside the rules</w:t>
+      </w:r>
+      <w:r>
+        <w:rPr>
+          <w:rFonts w:ascii="Times New Roman" w:hAnsi="Times New Roman" w:cs="Times New Roman"/>
+          <w:sz w:val="22"/>
+          <w:szCs w:val="22"/>
+        </w:rPr>
+        <w:t>.</w:t>
       </w:r>
     </w:p>
     <w:p>
@@ -553,8 +733,8 @@
       <w:tblGrid>
         <w:gridCol w:w="1386"/>
         <w:gridCol w:w="1508"/>
-        <w:gridCol w:w="946"/>
-        <w:gridCol w:w="5520"/>
+        <w:gridCol w:w="881"/>
+        <w:gridCol w:w="5585"/>
       </w:tblGrid>
       <w:tr>
         <w:trPr>
@@ -616,7 +796,7 @@
         </w:tc>
         <w:tc>
           <w:tcPr>
-            <w:tcW w:w="946" w:type="dxa"/>
+            <w:tcW w:w="881" w:type="dxa"/>
             <w:shd w:val="clear" w:color="auto" w:fill="E8E8E8"/>
           </w:tcPr>
           <w:p>
@@ -642,7 +822,7 @@
         </w:tc>
         <w:tc>
           <w:tcPr>
-            <w:tcW w:w="5520" w:type="dxa"/>
+            <w:tcW w:w="5585" w:type="dxa"/>
             <w:shd w:val="clear" w:color="auto" w:fill="E8E8E8"/>
           </w:tcPr>
           <w:p>
@@ -674,7 +854,8 @@
           </w:tcPr>
           <w:p>
             <w:pPr>
-              <w:jc w:val="both"/>
+              <w:spacing w:line="360" w:lineRule="auto"/>
+              <w:jc w:val="center"/>
               <w:rPr>
                 <w:rFonts w:ascii="Times New Roman" w:hAnsi="Times New Roman" w:cs="Times New Roman"/>
                 <w:sz w:val="22"/>
@@ -697,7 +878,8 @@
           </w:tcPr>
           <w:p>
             <w:pPr>
-              <w:jc w:val="both"/>
+              <w:spacing w:line="360" w:lineRule="auto"/>
+              <w:jc w:val="center"/>
               <w:rPr>
                 <w:rFonts w:ascii="Times New Roman" w:hAnsi="Times New Roman" w:cs="Times New Roman"/>
                 <w:sz w:val="22"/>
@@ -716,11 +898,12 @@
         </w:tc>
         <w:tc>
           <w:tcPr>
-            <w:tcW w:w="946" w:type="dxa"/>
+            <w:tcW w:w="881" w:type="dxa"/>
           </w:tcPr>
           <w:p>
             <w:pPr>
-              <w:jc w:val="both"/>
+              <w:spacing w:line="360" w:lineRule="auto"/>
+              <w:jc w:val="center"/>
               <w:rPr>
                 <w:rFonts w:ascii="Times New Roman" w:hAnsi="Times New Roman" w:cs="Times New Roman"/>
                 <w:sz w:val="22"/>
@@ -739,10 +922,11 @@
         </w:tc>
         <w:tc>
           <w:tcPr>
-            <w:tcW w:w="5520" w:type="dxa"/>
+            <w:tcW w:w="5585" w:type="dxa"/>
           </w:tcPr>
           <w:p>
             <w:pPr>
+              <w:spacing w:line="360" w:lineRule="auto"/>
               <w:jc w:val="both"/>
               <w:rPr>
                 <w:rFonts w:ascii="Times New Roman" w:hAnsi="Times New Roman" w:cs="Times New Roman"/>
@@ -768,7 +952,8 @@
           </w:tcPr>
           <w:p>
             <w:pPr>
-              <w:jc w:val="both"/>
+              <w:spacing w:line="360" w:lineRule="auto"/>
+              <w:jc w:val="center"/>
               <w:rPr>
                 <w:rFonts w:ascii="Times New Roman" w:hAnsi="Times New Roman" w:cs="Times New Roman"/>
                 <w:sz w:val="22"/>
@@ -791,7 +976,8 @@
           </w:tcPr>
           <w:p>
             <w:pPr>
-              <w:jc w:val="both"/>
+              <w:spacing w:line="360" w:lineRule="auto"/>
+              <w:jc w:val="center"/>
               <w:rPr>
                 <w:rFonts w:ascii="Times New Roman" w:hAnsi="Times New Roman" w:cs="Times New Roman"/>
                 <w:sz w:val="22"/>
@@ -810,11 +996,12 @@
         </w:tc>
         <w:tc>
           <w:tcPr>
-            <w:tcW w:w="946" w:type="dxa"/>
+            <w:tcW w:w="881" w:type="dxa"/>
           </w:tcPr>
           <w:p>
             <w:pPr>
-              <w:jc w:val="both"/>
+              <w:spacing w:line="360" w:lineRule="auto"/>
+              <w:jc w:val="center"/>
               <w:rPr>
                 <w:rFonts w:ascii="Times New Roman" w:hAnsi="Times New Roman" w:cs="Times New Roman"/>
                 <w:sz w:val="22"/>
@@ -833,10 +1020,11 @@
         </w:tc>
         <w:tc>
           <w:tcPr>
-            <w:tcW w:w="5520" w:type="dxa"/>
+            <w:tcW w:w="5585" w:type="dxa"/>
           </w:tcPr>
           <w:p>
             <w:pPr>
+              <w:spacing w:line="360" w:lineRule="auto"/>
               <w:jc w:val="both"/>
               <w:rPr>
                 <w:rFonts w:ascii="Times New Roman" w:hAnsi="Times New Roman" w:cs="Times New Roman"/>
@@ -862,7 +1050,8 @@
           </w:tcPr>
           <w:p>
             <w:pPr>
-              <w:jc w:val="both"/>
+              <w:spacing w:line="360" w:lineRule="auto"/>
+              <w:jc w:val="center"/>
               <w:rPr>
                 <w:rFonts w:ascii="Times New Roman" w:hAnsi="Times New Roman" w:cs="Times New Roman"/>
                 <w:sz w:val="22"/>
@@ -885,7 +1074,8 @@
           </w:tcPr>
           <w:p>
             <w:pPr>
-              <w:jc w:val="both"/>
+              <w:spacing w:line="360" w:lineRule="auto"/>
+              <w:jc w:val="center"/>
               <w:rPr>
                 <w:rFonts w:ascii="Times New Roman" w:hAnsi="Times New Roman" w:cs="Times New Roman"/>
                 <w:sz w:val="22"/>
@@ -904,11 +1094,12 @@
         </w:tc>
         <w:tc>
           <w:tcPr>
-            <w:tcW w:w="946" w:type="dxa"/>
+            <w:tcW w:w="881" w:type="dxa"/>
           </w:tcPr>
           <w:p>
             <w:pPr>
-              <w:jc w:val="both"/>
+              <w:spacing w:line="360" w:lineRule="auto"/>
+              <w:jc w:val="center"/>
               <w:rPr>
                 <w:rFonts w:ascii="Times New Roman" w:hAnsi="Times New Roman" w:cs="Times New Roman"/>
                 <w:sz w:val="22"/>
@@ -927,10 +1118,11 @@
         </w:tc>
         <w:tc>
           <w:tcPr>
-            <w:tcW w:w="5520" w:type="dxa"/>
+            <w:tcW w:w="5585" w:type="dxa"/>
           </w:tcPr>
           <w:p>
             <w:pPr>
+              <w:spacing w:line="360" w:lineRule="auto"/>
               <w:jc w:val="both"/>
               <w:rPr>
                 <w:rFonts w:ascii="Times New Roman" w:hAnsi="Times New Roman" w:cs="Times New Roman"/>
@@ -956,7 +1148,8 @@
           </w:tcPr>
           <w:p>
             <w:pPr>
-              <w:jc w:val="both"/>
+              <w:spacing w:line="360" w:lineRule="auto"/>
+              <w:jc w:val="center"/>
               <w:rPr>
                 <w:rFonts w:ascii="Times New Roman" w:hAnsi="Times New Roman" w:cs="Times New Roman"/>
                 <w:sz w:val="22"/>
@@ -979,7 +1172,8 @@
           </w:tcPr>
           <w:p>
             <w:pPr>
-              <w:jc w:val="both"/>
+              <w:spacing w:line="360" w:lineRule="auto"/>
+              <w:jc w:val="center"/>
               <w:rPr>
                 <w:rFonts w:ascii="Times New Roman" w:hAnsi="Times New Roman" w:cs="Times New Roman"/>
                 <w:sz w:val="22"/>
@@ -998,11 +1192,12 @@
         </w:tc>
         <w:tc>
           <w:tcPr>
-            <w:tcW w:w="946" w:type="dxa"/>
+            <w:tcW w:w="881" w:type="dxa"/>
           </w:tcPr>
           <w:p>
             <w:pPr>
-              <w:jc w:val="both"/>
+              <w:spacing w:line="360" w:lineRule="auto"/>
+              <w:jc w:val="center"/>
               <w:rPr>
                 <w:rFonts w:ascii="Times New Roman" w:hAnsi="Times New Roman" w:cs="Times New Roman"/>
                 <w:sz w:val="22"/>
@@ -1021,10 +1216,11 @@
         </w:tc>
         <w:tc>
           <w:tcPr>
-            <w:tcW w:w="5520" w:type="dxa"/>
+            <w:tcW w:w="5585" w:type="dxa"/>
           </w:tcPr>
           <w:p>
             <w:pPr>
+              <w:spacing w:line="360" w:lineRule="auto"/>
               <w:jc w:val="both"/>
               <w:rPr>
                 <w:rFonts w:ascii="Times New Roman" w:hAnsi="Times New Roman" w:cs="Times New Roman"/>
@@ -1050,7 +1246,8 @@
           </w:tcPr>
           <w:p>
             <w:pPr>
-              <w:jc w:val="both"/>
+              <w:spacing w:line="360" w:lineRule="auto"/>
+              <w:jc w:val="center"/>
               <w:rPr>
                 <w:rFonts w:ascii="Times New Roman" w:hAnsi="Times New Roman" w:cs="Times New Roman"/>
                 <w:sz w:val="22"/>
@@ -1073,7 +1270,8 @@
           </w:tcPr>
           <w:p>
             <w:pPr>
-              <w:jc w:val="both"/>
+              <w:spacing w:line="360" w:lineRule="auto"/>
+              <w:jc w:val="center"/>
               <w:rPr>
                 <w:rFonts w:ascii="Times New Roman" w:hAnsi="Times New Roman" w:cs="Times New Roman"/>
                 <w:sz w:val="22"/>
@@ -1092,11 +1290,12 @@
         </w:tc>
         <w:tc>
           <w:tcPr>
-            <w:tcW w:w="946" w:type="dxa"/>
+            <w:tcW w:w="881" w:type="dxa"/>
           </w:tcPr>
           <w:p>
             <w:pPr>
-              <w:jc w:val="both"/>
+              <w:spacing w:line="360" w:lineRule="auto"/>
+              <w:jc w:val="center"/>
               <w:rPr>
                 <w:rFonts w:ascii="Times New Roman" w:hAnsi="Times New Roman" w:cs="Times New Roman"/>
                 <w:sz w:val="22"/>
@@ -1115,10 +1314,11 @@
         </w:tc>
         <w:tc>
           <w:tcPr>
-            <w:tcW w:w="5520" w:type="dxa"/>
+            <w:tcW w:w="5585" w:type="dxa"/>
           </w:tcPr>
           <w:p>
             <w:pPr>
+              <w:spacing w:line="360" w:lineRule="auto"/>
               <w:jc w:val="both"/>
               <w:rPr>
                 <w:rFonts w:ascii="Times New Roman" w:hAnsi="Times New Roman" w:cs="Times New Roman"/>
@@ -1315,7 +1515,39 @@
           <w:sz w:val="22"/>
           <w:szCs w:val="22"/>
         </w:rPr>
-        <w:t xml:space="preserve"> entry point, and the serialization path never ran. Raw invalid UTF-8 is the most plausible remaining home for a memory bug in a byte-oriented C parser, since parson doesn't validate encoding, and it reached only about 11% of inputs from iteration 3 on. Mid-range nesting stayed thin, since the histogram clusters near the bottom and at the wall.</w:t>
+        <w:t xml:space="preserve"> entry point, and the serialization path never ran. </w:t>
+      </w:r>
+      <w:r>
+        <w:rPr>
+          <w:rFonts w:ascii="Times New Roman" w:hAnsi="Times New Roman" w:cs="Times New Roman"/>
+          <w:sz w:val="22"/>
+          <w:szCs w:val="22"/>
+        </w:rPr>
+        <w:t>The strongest remaining suspect for a hidden memory bug is invalid UTF-8 inside strings, since parson does no encoding checks whatsoever, but that path only showed up in roughly 11% of inputs from iteration 3 on</w:t>
+      </w:r>
+      <w:r>
+        <w:rPr>
+          <w:rFonts w:ascii="Times New Roman" w:hAnsi="Times New Roman" w:cs="Times New Roman"/>
+          <w:sz w:val="22"/>
+          <w:szCs w:val="22"/>
+        </w:rPr>
+        <w:t xml:space="preserve">. </w:t>
+      </w:r>
+      <w:r>
+        <w:rPr>
+          <w:rFonts w:ascii="Times New Roman" w:hAnsi="Times New Roman" w:cs="Times New Roman"/>
+          <w:sz w:val="22"/>
+          <w:szCs w:val="22"/>
+        </w:rPr>
+        <w:t>The same gap shows up in nesting depth: most inputs sit either near zero or right at the wall, so the middle range was barely tested</w:t>
+      </w:r>
+      <w:r>
+        <w:rPr>
+          <w:rFonts w:ascii="Times New Roman" w:hAnsi="Times New Roman" w:cs="Times New Roman"/>
+          <w:sz w:val="22"/>
+          <w:szCs w:val="22"/>
+        </w:rPr>
+        <w:t>.</w:t>
       </w:r>
     </w:p>
     <w:p>
@@ -1354,7 +1586,15 @@
           <w:sz w:val="22"/>
           <w:szCs w:val="22"/>
         </w:rPr>
-        <w:t>The first live run crashed with a JSONDecodeError. At first that looked like a bug in the parser, but it wasn't. The token limit I'd set was too low, and once adaptive thinking plus a full strategy module used up that budget, the response got cut off in the middle of a string. Raising the limit and checking the stop reason before trying to parse the response fixed it, though it cost one wasted API call to find.</w:t>
+        <w:t>The first real run crashed with a JSONDecodeError. It looked like a parser bug, but it wasn't: my token limit was too low, and the response got cut off mid-string once thinking and a full strategy module ate the budget. Raising the limit and checking the stop reason before parsing fixed it, at the cost of one wasted call</w:t>
+      </w:r>
+      <w:r>
+        <w:rPr>
+          <w:rFonts w:ascii="Times New Roman" w:hAnsi="Times New Roman" w:cs="Times New Roman"/>
+          <w:sz w:val="22"/>
+          <w:szCs w:val="22"/>
+        </w:rPr>
+        <w:t>.</w:t>
       </w:r>
     </w:p>
     <w:p>
@@ -1373,7 +1613,82 @@
           <w:sz w:val="22"/>
           <w:szCs w:val="22"/>
         </w:rPr>
-        <w:t>Three judgment calls are worth explaining. First, deduplication: I group crashes by hashing their top three stack frames, after stripping out addresses and library noise. That logic is documented in fuzzer/triage.py. It was never tested against a real JSON crash here, since parson never crashed, but the same method was tested on a real crash in the companion TOML report, where it revealed a real weakness: it over-counts stack-overflow bugs, splitting one root cause into four signatures. Second, timeouts: a hang counts as a crash, the same as a sanitizer abort. That's the right call, even though nothing here ever came close to timing out. Third, the harness frees the input buffer before touching the parse tree, on purpose. If parson ever kept a pointer into that freed memory, this would catch it as a real use-after-free instead of hiding it. Nothing tripped that check either, which is a small good sign for how parson manages memory.</w:t>
+        <w:t xml:space="preserve">Three judgment calls are worth explaining. First, deduplication: I group crashes by hashing their top three stack frames, after stripping out addresses and library noise. It was never tested against a real JSON crash here, since parson never crashed, but the same method was tested on a real crash in the </w:t>
+      </w:r>
+      <w:r>
+        <w:rPr>
+          <w:rFonts w:ascii="Times New Roman" w:hAnsi="Times New Roman" w:cs="Times New Roman"/>
+          <w:sz w:val="22"/>
+          <w:szCs w:val="22"/>
+        </w:rPr>
+        <w:t>secondary</w:t>
+      </w:r>
+      <w:r>
+        <w:rPr>
+          <w:rFonts w:ascii="Times New Roman" w:hAnsi="Times New Roman" w:cs="Times New Roman"/>
+          <w:sz w:val="22"/>
+          <w:szCs w:val="22"/>
+        </w:rPr>
+        <w:t xml:space="preserve"> TOML report, where it revealed a real weakness: </w:t>
+      </w:r>
+      <w:r>
+        <w:rPr>
+          <w:rFonts w:ascii="Times New Roman" w:hAnsi="Times New Roman" w:cs="Times New Roman"/>
+          <w:sz w:val="22"/>
+          <w:szCs w:val="22"/>
+        </w:rPr>
+        <w:t xml:space="preserve">it </w:t>
+      </w:r>
+      <w:r>
+        <w:rPr>
+          <w:rFonts w:ascii="Times New Roman" w:hAnsi="Times New Roman" w:cs="Times New Roman"/>
+          <w:sz w:val="22"/>
+          <w:szCs w:val="22"/>
+        </w:rPr>
+        <w:t xml:space="preserve">over-counts stack-overflow bugs, splitting one root cause into four signatures. Second, timeouts: a hang counts as a crash, the same as a sanitizer abort. </w:t>
+      </w:r>
+      <w:r>
+        <w:rPr>
+          <w:rFonts w:ascii="Times New Roman" w:hAnsi="Times New Roman" w:cs="Times New Roman"/>
+          <w:sz w:val="22"/>
+          <w:szCs w:val="22"/>
+        </w:rPr>
+        <w:t xml:space="preserve">A parser that never terminates is a denial-of-service bug </w:t>
+      </w:r>
+      <w:r>
+        <w:rPr>
+          <w:rFonts w:ascii="Times New Roman" w:hAnsi="Times New Roman" w:cs="Times New Roman"/>
+          <w:sz w:val="22"/>
+          <w:szCs w:val="22"/>
+        </w:rPr>
+        <w:t>whether</w:t>
+      </w:r>
+      <w:r>
+        <w:rPr>
+          <w:rFonts w:ascii="Times New Roman" w:hAnsi="Times New Roman" w:cs="Times New Roman"/>
+          <w:sz w:val="22"/>
+          <w:szCs w:val="22"/>
+        </w:rPr>
+        <w:t xml:space="preserve"> a sanitizer ever fires. Nothing here came close to timing out</w:t>
+      </w:r>
+      <w:r>
+        <w:rPr>
+          <w:rFonts w:ascii="Times New Roman" w:hAnsi="Times New Roman" w:cs="Times New Roman"/>
+          <w:sz w:val="22"/>
+          <w:szCs w:val="22"/>
+        </w:rPr>
+        <w:t>.</w:t>
+      </w:r>
+      <w:r>
+        <w:t xml:space="preserve"> </w:t>
+      </w:r>
+      <w:r>
+        <w:rPr>
+          <w:rFonts w:ascii="Times New Roman" w:hAnsi="Times New Roman" w:cs="Times New Roman"/>
+          <w:sz w:val="22"/>
+          <w:szCs w:val="22"/>
+        </w:rPr>
+        <w:t>Third, the input buffer is freed before the parse tree on purpose, so a retained pointer would show up as a real use-after-free rather than stay hidden. Nothing did.</w:t>
       </w:r>
     </w:p>
     <w:p>
@@ -2313,7 +2628,6 @@
   <w:style w:type="character" w:default="1" w:styleId="DefaultParagraphFont">
     <w:name w:val="Default Paragraph Font"/>
     <w:uiPriority w:val="1"/>
-    <w:semiHidden/>
     <w:unhideWhenUsed/>
   </w:style>
   <w:style w:type="table" w:default="1" w:styleId="TableNormal">

</xml_diff>